<commit_message>
docs: rewrite pre-read as a real investor memo (not a deck copy)
Restructured into the format top VCs use, and folded in what the deck lacks: Summary, Market and
Timing, Product, Business Model (explicit unit economics), Go-to-Market, Why We Win (precedent +
moat), Team (placeholder), Status and Ask, and an honest Risks and Open Questions section. Keeps
the quantified, cited key details.
</commit_message>
<xml_diff>
--- a/pitch/cropconnect-preread.docx
+++ b/pitch/cropconnect-preread.docx
@@ -25,7 +25,7 @@
           <w:color w:val="235C3A"/>
           <w:sz w:val="24"/>
         </w:rPr>
-        <w:t>Problem</w:t>
+        <w:t>Summary</w:t>
       </w:r>
     </w:p>
     <w:p>
@@ -38,7 +38,81 @@
           <w:color w:val="16241C"/>
           <w:sz w:val="21"/>
         </w:rPr>
-        <w:t xml:space="preserve">Independent full-service restaurants run on a net margin of about </w:t>
+        <w:t xml:space="preserve">CropConnect is an AI agent that runs local sourcing for restaurants end to end: it finds the farms, signs the contracts, runs weekly delivery, holds payment in escrow, and tracks the added margin. The owner does two things — ask, and put the dish on the menu. Diners increasingly choose restaurants for local food, but sourcing it by hand is a second full-time job, so most independents skip it; an AI agent makes that work cheap enough to do for them. The product is built and live. We are </w:t>
+      </w:r>
+      <w:r>
+        <w:rPr>
+          <w:b/>
+          <w:color w:val="16241C"/>
+          <w:sz w:val="21"/>
+        </w:rPr>
+        <w:t>pre-revenue</w:t>
+      </w:r>
+      <w:r>
+        <w:rPr>
+          <w:b w:val="0"/>
+          <w:color w:val="16241C"/>
+          <w:sz w:val="21"/>
+        </w:rPr>
+        <w:t xml:space="preserve">, raising </w:t>
+      </w:r>
+      <w:r>
+        <w:rPr>
+          <w:b/>
+          <w:color w:val="16241C"/>
+          <w:sz w:val="21"/>
+        </w:rPr>
+        <w:t>$50,000–$100,000</w:t>
+      </w:r>
+      <w:r>
+        <w:rPr>
+          <w:b w:val="0"/>
+          <w:color w:val="16241C"/>
+          <w:sz w:val="21"/>
+        </w:rPr>
+        <w:t xml:space="preserve"> on a SAFE to land the first </w:t>
+      </w:r>
+      <w:r>
+        <w:rPr>
+          <w:b/>
+          <w:color w:val="16241C"/>
+          <w:sz w:val="21"/>
+        </w:rPr>
+        <w:t>15 paying kitchens in Indianapolis</w:t>
+      </w:r>
+      <w:r>
+        <w:rPr>
+          <w:b w:val="0"/>
+          <w:color w:val="16241C"/>
+          <w:sz w:val="21"/>
+        </w:rPr>
+        <w:t>.</w:t>
+      </w:r>
+    </w:p>
+    <w:p>
+      <w:pPr>
+        <w:spacing w:before="220" w:after="60"/>
+      </w:pPr>
+      <w:r>
+        <w:rPr>
+          <w:b/>
+          <w:color w:val="235C3A"/>
+          <w:sz w:val="24"/>
+        </w:rPr>
+        <w:t>Market and Timing</w:t>
+      </w:r>
+    </w:p>
+    <w:p>
+      <w:pPr>
+        <w:jc w:val="both"/>
+      </w:pPr>
+      <w:r>
+        <w:rPr>
+          <w:b w:val="0"/>
+          <w:color w:val="16241C"/>
+          <w:sz w:val="21"/>
+        </w:rPr>
+        <w:t xml:space="preserve">Independent full-service restaurants net about </w:t>
       </w:r>
       <w:r>
         <w:rPr>
@@ -54,23 +128,7 @@
           <w:color w:val="16241C"/>
           <w:sz w:val="21"/>
         </w:rPr>
-        <w:t>.</w:t>
-      </w:r>
-      <w:r>
-        <w:rPr>
-          <w:color w:val="235C3A"/>
-          <w:sz w:val="14"/>
-          <w:vertAlign w:val="superscript"/>
-        </w:rPr>
-        <w:t>1</w:t>
-      </w:r>
-      <w:r>
-        <w:rPr>
-          <w:b w:val="0"/>
-          <w:color w:val="16241C"/>
-          <w:sz w:val="21"/>
-        </w:rPr>
-        <w:t xml:space="preserve"> Food and labor alone consume roughly </w:t>
+        <w:t xml:space="preserve">, with food and labor consuming roughly </w:t>
       </w:r>
       <w:r>
         <w:rPr>
@@ -102,20 +160,7 @@
           <w:color w:val="16241C"/>
           <w:sz w:val="21"/>
         </w:rPr>
-        <w:t xml:space="preserve"> There is almost no room to cut, so growth has to come from charging more for the same seats.</w:t>
-      </w:r>
-    </w:p>
-    <w:p>
-      <w:pPr>
-        <w:jc w:val="both"/>
-      </w:pPr>
-      <w:r>
-        <w:rPr>
-          <w:b w:val="0"/>
-          <w:color w:val="16241C"/>
-          <w:sz w:val="21"/>
-        </w:rPr>
-        <w:t xml:space="preserve">Local sourcing is how kitchens do that. </w:t>
+        <w:t xml:space="preserve"> There is little to cut, so growth has to come from charging more for the same seats. Local sourcing is how kitchens do that: </w:t>
       </w:r>
       <w:r>
         <w:rPr>
@@ -131,7 +176,7 @@
           <w:color w:val="16241C"/>
           <w:sz w:val="21"/>
         </w:rPr>
-        <w:t xml:space="preserve"> say they are more likely to choose a restaurant that offers locally sourced food,</w:t>
+        <w:t xml:space="preserve"> are more likely to choose a restaurant offering locally sourced food,</w:t>
       </w:r>
       <w:r>
         <w:rPr>
@@ -163,7 +208,7 @@
           <w:color w:val="16241C"/>
           <w:sz w:val="21"/>
         </w:rPr>
-        <w:t xml:space="preserve"> want to know the story behind what they eat.</w:t>
+        <w:t xml:space="preserve"> want the story behind what they eat;</w:t>
       </w:r>
       <w:r>
         <w:rPr>
@@ -179,196 +224,7 @@
           <w:color w:val="16241C"/>
           <w:sz w:val="21"/>
         </w:rPr>
-        <w:t xml:space="preserve"> But sourcing locally by hand is a second full-time job: finding farms, vetting them, negotiating prices, writing agreements, scheduling deliveries, and covering shortfalls when a crop comes up short. An owner already working 60-hour weeks skips it. </w:t>
-      </w:r>
-      <w:r>
-        <w:rPr>
-          <w:b/>
-          <w:color w:val="16241C"/>
-          <w:sz w:val="21"/>
-        </w:rPr>
-        <w:t>The demand exists; the labor to capture it does not.</w:t>
-      </w:r>
-    </w:p>
-    <w:p>
-      <w:pPr>
-        <w:spacing w:before="220" w:after="60"/>
-      </w:pPr>
-      <w:r>
-        <w:rPr>
-          <w:b/>
-          <w:color w:val="235C3A"/>
-          <w:sz w:val="24"/>
-        </w:rPr>
-        <w:t>Product</w:t>
-      </w:r>
-    </w:p>
-    <w:p>
-      <w:pPr>
-        <w:jc w:val="both"/>
-      </w:pPr>
-      <w:r>
-        <w:rPr>
-          <w:b w:val="0"/>
-          <w:color w:val="16241C"/>
-          <w:sz w:val="21"/>
-        </w:rPr>
-        <w:t xml:space="preserve">CropConnect is an AI agent that runs local sourcing end to end. The restaurant enters one need — say, </w:t>
-      </w:r>
-      <w:r>
-        <w:rPr>
-          <w:b/>
-          <w:color w:val="16241C"/>
-          <w:sz w:val="21"/>
-        </w:rPr>
-        <w:t>40 lbs of heirloom tomatoes a week</w:t>
-      </w:r>
-      <w:r>
-        <w:rPr>
-          <w:b w:val="0"/>
-          <w:color w:val="16241C"/>
-          <w:sz w:val="21"/>
-        </w:rPr>
-        <w:t>. With no further work from the owner, the agent:</w:t>
-      </w:r>
-    </w:p>
-    <w:p>
-      <w:pPr>
-        <w:pStyle w:val="ListBullet"/>
-        <w:spacing w:after="60"/>
-      </w:pPr>
-      <w:r>
-        <w:rPr>
-          <w:b w:val="0"/>
-          <w:color w:val="16241C"/>
-          <w:sz w:val="21"/>
-        </w:rPr>
-        <w:t>ranks vetted local farms by crop, distance, reliability, and price;</w:t>
-      </w:r>
-    </w:p>
-    <w:p>
-      <w:pPr>
-        <w:pStyle w:val="ListBullet"/>
-        <w:spacing w:after="60"/>
-      </w:pPr>
-      <w:r>
-        <w:rPr>
-          <w:b w:val="0"/>
-          <w:color w:val="16241C"/>
-          <w:sz w:val="21"/>
-        </w:rPr>
-        <w:t>splits the order across several farms if one cannot cover the volume;</w:t>
-      </w:r>
-    </w:p>
-    <w:p>
-      <w:pPr>
-        <w:pStyle w:val="ListBullet"/>
-        <w:spacing w:after="60"/>
-      </w:pPr>
-      <w:r>
-        <w:rPr>
-          <w:b w:val="0"/>
-          <w:color w:val="16241C"/>
-          <w:sz w:val="21"/>
-        </w:rPr>
-        <w:t>drafts a supply contract and runs a short negotiation over quality terms (organic, grade, freshness window);</w:t>
-      </w:r>
-    </w:p>
-    <w:p>
-      <w:pPr>
-        <w:pStyle w:val="ListBullet"/>
-        <w:spacing w:after="60"/>
-      </w:pPr>
-      <w:r>
-        <w:rPr>
-          <w:b w:val="0"/>
-          <w:color w:val="16241C"/>
-          <w:sz w:val="21"/>
-        </w:rPr>
-        <w:t>schedules weekly deliveries through third-party logistics;</w:t>
-      </w:r>
-    </w:p>
-    <w:p>
-      <w:pPr>
-        <w:pStyle w:val="ListBullet"/>
-        <w:spacing w:after="60"/>
-      </w:pPr>
-      <w:r>
-        <w:rPr>
-          <w:b w:val="0"/>
-          <w:color w:val="16241C"/>
-          <w:sz w:val="21"/>
-        </w:rPr>
-        <w:t>holds the food payment in escrow and releases it to the farm only after delivery is confirmed; and</w:t>
-      </w:r>
-    </w:p>
-    <w:p>
-      <w:pPr>
-        <w:pStyle w:val="ListBullet"/>
-        <w:spacing w:after="60"/>
-      </w:pPr>
-      <w:r>
-        <w:rPr>
-          <w:b w:val="0"/>
-          <w:color w:val="16241C"/>
-          <w:sz w:val="21"/>
-        </w:rPr>
-        <w:t>tracks the added margin on each dish.</w:t>
-      </w:r>
-    </w:p>
-    <w:p>
-      <w:pPr>
-        <w:jc w:val="both"/>
-      </w:pPr>
-      <w:r>
-        <w:rPr>
-          <w:b w:val="0"/>
-          <w:color w:val="16241C"/>
-          <w:sz w:val="21"/>
-        </w:rPr>
-        <w:t xml:space="preserve">Setup takes about </w:t>
-      </w:r>
-      <w:r>
-        <w:rPr>
-          <w:b/>
-          <w:color w:val="16241C"/>
-          <w:sz w:val="21"/>
-        </w:rPr>
-        <w:t>ten minutes</w:t>
-      </w:r>
-      <w:r>
-        <w:rPr>
-          <w:b w:val="0"/>
-          <w:color w:val="16241C"/>
-          <w:sz w:val="21"/>
-        </w:rPr>
-        <w:t>, and the first ingredient is free. The product is built and live today, including the agent, the contracts, the escrow, and a free instant sourcing audit any restaurant can run before signing up.</w:t>
-      </w:r>
-    </w:p>
-    <w:p>
-      <w:pPr>
-        <w:spacing w:before="220" w:after="60"/>
-      </w:pPr>
-      <w:r>
-        <w:rPr>
-          <w:b/>
-          <w:color w:val="235C3A"/>
-          <w:sz w:val="24"/>
-        </w:rPr>
-        <w:t>Why Now</w:t>
-      </w:r>
-    </w:p>
-    <w:p>
-      <w:pPr>
-        <w:jc w:val="both"/>
-      </w:pPr>
-      <w:r>
-        <w:rPr>
-          <w:b w:val="0"/>
-          <w:color w:val="16241C"/>
-          <w:sz w:val="21"/>
-        </w:rPr>
-        <w:t xml:space="preserve">Two curves crossed. Diner demand for local has risen for years — the share of shoppers who rate ingredient transparency as important went from </w:t>
+        <w:t xml:space="preserve"> the share rating ingredient transparency as important rose from </w:t>
       </w:r>
       <w:r>
         <w:rPr>
@@ -400,20 +256,7 @@
           <w:color w:val="16241C"/>
           <w:sz w:val="21"/>
         </w:rPr>
-        <w:t xml:space="preserve"> And AI agents have only just made the coordination behind local sourcing cheap enough to give away as a done-for-you service. Work that used to require a salaried sourcing manager can now be run by software. This is the first moment both are true at once.</w:t>
-      </w:r>
-    </w:p>
-    <w:p>
-      <w:pPr>
-        <w:spacing w:before="220" w:after="60"/>
-      </w:pPr>
-      <w:r>
-        <w:rPr>
-          <w:b/>
-          <w:color w:val="235C3A"/>
-          <w:sz w:val="24"/>
-        </w:rPr>
-        <w:t>Market</w:t>
+        <w:t xml:space="preserve"> The barrier is labor, not demand — doing it by hand means finding farms, vetting them, negotiating, contracting, scheduling, and covering shortfalls.</w:t>
       </w:r>
     </w:p>
     <w:p>
@@ -426,7 +269,7 @@
           <w:color w:val="16241C"/>
           <w:sz w:val="21"/>
         </w:rPr>
-        <w:t xml:space="preserve">U.S. restaurants did about </w:t>
+        <w:t xml:space="preserve">Two things just became true at once: durable diner demand for local, and AI agents finally cheap enough to run that coordination as a done-for-you service. The market is large — U.S. restaurants did about </w:t>
       </w:r>
       <w:r>
         <w:rPr>
@@ -442,7 +285,7 @@
           <w:color w:val="16241C"/>
           <w:sz w:val="21"/>
         </w:rPr>
-        <w:t xml:space="preserve"> in sales across roughly </w:t>
+        <w:t xml:space="preserve"> across roughly </w:t>
       </w:r>
       <w:r>
         <w:rPr>
@@ -468,13 +311,18 @@
         </w:rPr>
         <w:t>4</w:t>
       </w:r>
+    </w:p>
+    <w:p>
+      <w:pPr>
+        <w:spacing w:before="220" w:after="60"/>
+      </w:pPr>
       <w:r>
         <w:rPr>
-          <w:b w:val="0"/>
-          <w:color w:val="16241C"/>
-          <w:sz w:val="21"/>
+          <w:b/>
+          <w:color w:val="235C3A"/>
+          <w:sz w:val="24"/>
         </w:rPr>
-        <w:t xml:space="preserve"> Our wedge is the independent full-service segment — the operators who both want local sourcing and lack the staff to do it. We win one metro at a time and earn density before expanding.</w:t>
+        <w:t>Product</w:t>
       </w:r>
     </w:p>
     <w:p>
@@ -487,7 +335,7 @@
           <w:color w:val="16241C"/>
           <w:sz w:val="21"/>
         </w:rPr>
-        <w:t xml:space="preserve">In the </w:t>
+        <w:t xml:space="preserve">The restaurant enters one need — say, 40 lbs of heirloom tomatoes a week — and the agent, with no further work from the owner: ranks vetted local farms by crop, distance, reliability, and price; splits the order across farms if one cannot cover it; drafts a contract and negotiates quality terms; schedules weekly third-party delivery; holds payment in escrow until delivery is confirmed; and tracks the added margin per dish. Setup takes about </w:t>
       </w:r>
       <w:r>
         <w:rPr>
@@ -495,7 +343,7 @@
           <w:color w:val="16241C"/>
           <w:sz w:val="21"/>
         </w:rPr>
-        <w:t>Indianapolis metro</w:t>
+        <w:t>ten minutes</w:t>
       </w:r>
       <w:r>
         <w:rPr>
@@ -503,7 +351,7 @@
           <w:color w:val="16241C"/>
           <w:sz w:val="21"/>
         </w:rPr>
-        <w:t xml:space="preserve"> there are roughly </w:t>
+        <w:t xml:space="preserve"> and the first ingredient is free. The product, including the agent, contracts, escrow, and a free instant sourcing audit, is </w:t>
       </w:r>
       <w:r>
         <w:rPr>
@@ -511,365 +359,7 @@
           <w:color w:val="16241C"/>
           <w:sz w:val="21"/>
         </w:rPr>
-        <w:t>4,500</w:t>
-      </w:r>
-      <w:r>
-        <w:rPr>
-          <w:b w:val="0"/>
-          <w:color w:val="16241C"/>
-          <w:sz w:val="21"/>
-        </w:rPr>
-        <w:t xml:space="preserve"> restaurants; we estimate about </w:t>
-      </w:r>
-      <w:r>
-        <w:rPr>
-          <w:b/>
-          <w:color w:val="16241C"/>
-          <w:sz w:val="21"/>
-        </w:rPr>
-        <w:t>1,500</w:t>
-      </w:r>
-      <w:r>
-        <w:rPr>
-          <w:b w:val="0"/>
-          <w:color w:val="16241C"/>
-          <w:sz w:val="21"/>
-        </w:rPr>
-        <w:t xml:space="preserve"> are target independents.</w:t>
-      </w:r>
-      <w:r>
-        <w:rPr>
-          <w:color w:val="235C3A"/>
-          <w:sz w:val="14"/>
-          <w:vertAlign w:val="superscript"/>
-        </w:rPr>
-        <w:t>5</w:t>
-      </w:r>
-      <w:r>
-        <w:rPr>
-          <w:b w:val="0"/>
-          <w:color w:val="16241C"/>
-          <w:sz w:val="21"/>
-        </w:rPr>
-        <w:t xml:space="preserve"> At a blended </w:t>
-      </w:r>
-      <w:r>
-        <w:rPr>
-          <w:b/>
-          <w:color w:val="16241C"/>
-          <w:sz w:val="21"/>
-        </w:rPr>
-        <w:t>$10,700</w:t>
-      </w:r>
-      <w:r>
-        <w:rPr>
-          <w:b w:val="0"/>
-          <w:color w:val="16241C"/>
-          <w:sz w:val="21"/>
-        </w:rPr>
-        <w:t xml:space="preserve"> per restaurant per year, that is about </w:t>
-      </w:r>
-      <w:r>
-        <w:rPr>
-          <w:b/>
-          <w:color w:val="16241C"/>
-          <w:sz w:val="21"/>
-        </w:rPr>
-        <w:t>$16 million</w:t>
-      </w:r>
-      <w:r>
-        <w:rPr>
-          <w:b w:val="0"/>
-          <w:color w:val="16241C"/>
-          <w:sz w:val="21"/>
-        </w:rPr>
-        <w:t xml:space="preserve"> of annual revenue available in Indianapolis alone, before a second market.</w:t>
-      </w:r>
-      <w:r>
-        <w:rPr>
-          <w:color w:val="235C3A"/>
-          <w:sz w:val="14"/>
-          <w:vertAlign w:val="superscript"/>
-        </w:rPr>
-        <w:t>5</w:t>
-      </w:r>
-    </w:p>
-    <w:p>
-      <w:pPr>
-        <w:spacing w:before="220" w:after="60"/>
-      </w:pPr>
-      <w:r>
-        <w:rPr>
-          <w:b/>
-          <w:color w:val="235C3A"/>
-          <w:sz w:val="24"/>
-        </w:rPr>
-        <w:t>Precedent</w:t>
-      </w:r>
-    </w:p>
-    <w:p>
-      <w:pPr>
-        <w:jc w:val="both"/>
-      </w:pPr>
-      <w:r>
-        <w:rPr>
-          <w:b w:val="0"/>
-          <w:color w:val="16241C"/>
-          <w:sz w:val="21"/>
-        </w:rPr>
-        <w:t>This is a graveyard, and the cause of death is consistent.</w:t>
-      </w:r>
-    </w:p>
-    <w:p>
-      <w:pPr>
-        <w:pStyle w:val="ListBullet"/>
-        <w:spacing w:after="60"/>
-      </w:pPr>
-      <w:r>
-        <w:rPr>
-          <w:b/>
-          <w:color w:val="16241C"/>
-          <w:sz w:val="21"/>
-        </w:rPr>
-        <w:t>Webvan</w:t>
-      </w:r>
-      <w:r>
-        <w:rPr>
-          <w:b w:val="0"/>
-          <w:color w:val="16241C"/>
-          <w:sz w:val="21"/>
-        </w:rPr>
-        <w:t xml:space="preserve"> raised more than </w:t>
-      </w:r>
-      <w:r>
-        <w:rPr>
-          <w:b/>
-          <w:color w:val="16241C"/>
-          <w:sz w:val="21"/>
-        </w:rPr>
-        <w:t>$800 million</w:t>
-      </w:r>
-      <w:r>
-        <w:rPr>
-          <w:b w:val="0"/>
-          <w:color w:val="16241C"/>
-          <w:sz w:val="21"/>
-        </w:rPr>
-        <w:t xml:space="preserve"> to deliver fresh groceries, built its own warehouses and truck fleet, expanded city by city, and filed for bankruptcy in 2001.</w:t>
-      </w:r>
-      <w:r>
-        <w:rPr>
-          <w:color w:val="235C3A"/>
-          <w:sz w:val="14"/>
-          <w:vertAlign w:val="superscript"/>
-        </w:rPr>
-        <w:t>6</w:t>
-      </w:r>
-    </w:p>
-    <w:p>
-      <w:pPr>
-        <w:pStyle w:val="ListBullet"/>
-        <w:spacing w:after="60"/>
-      </w:pPr>
-      <w:r>
-        <w:rPr>
-          <w:b/>
-          <w:color w:val="16241C"/>
-          <w:sz w:val="21"/>
-        </w:rPr>
-        <w:t>Good Eggs</w:t>
-      </w:r>
-      <w:r>
-        <w:rPr>
-          <w:b w:val="0"/>
-          <w:color w:val="16241C"/>
-          <w:sz w:val="21"/>
-        </w:rPr>
-        <w:t xml:space="preserve"> raised roughly </w:t>
-      </w:r>
-      <w:r>
-        <w:rPr>
-          <w:b/>
-          <w:color w:val="16241C"/>
-          <w:sz w:val="21"/>
-        </w:rPr>
-        <w:t>$50 million</w:t>
-      </w:r>
-      <w:r>
-        <w:rPr>
-          <w:b w:val="0"/>
-          <w:color w:val="16241C"/>
-          <w:sz w:val="21"/>
-        </w:rPr>
-        <w:t xml:space="preserve"> to deliver local food, scaled to four cities, and in 2015 laid off most of its staff and retreated to a single market.</w:t>
-      </w:r>
-      <w:r>
-        <w:rPr>
-          <w:color w:val="235C3A"/>
-          <w:sz w:val="14"/>
-          <w:vertAlign w:val="superscript"/>
-        </w:rPr>
-        <w:t>6</w:t>
-      </w:r>
-    </w:p>
-    <w:p>
-      <w:pPr>
-        <w:pStyle w:val="ListBullet"/>
-        <w:spacing w:after="60"/>
-      </w:pPr>
-      <w:r>
-        <w:rPr>
-          <w:b/>
-          <w:color w:val="16241C"/>
-          <w:sz w:val="21"/>
-        </w:rPr>
-        <w:t>Farmigo</w:t>
-      </w:r>
-      <w:r>
-        <w:rPr>
-          <w:b w:val="0"/>
-          <w:color w:val="16241C"/>
-          <w:sz w:val="21"/>
-        </w:rPr>
-        <w:t xml:space="preserve"> (2016), </w:t>
-      </w:r>
-      <w:r>
-        <w:rPr>
-          <w:b/>
-          <w:color w:val="16241C"/>
-          <w:sz w:val="21"/>
-        </w:rPr>
-        <w:t>Door to Door Organics</w:t>
-      </w:r>
-      <w:r>
-        <w:rPr>
-          <w:b w:val="0"/>
-          <w:color w:val="16241C"/>
-          <w:sz w:val="21"/>
-        </w:rPr>
-        <w:t xml:space="preserve"> (2016), and </w:t>
-      </w:r>
-      <w:r>
-        <w:rPr>
-          <w:b/>
-          <w:color w:val="16241C"/>
-          <w:sz w:val="21"/>
-        </w:rPr>
-        <w:t>Relay Foods</w:t>
-      </w:r>
-      <w:r>
-        <w:rPr>
-          <w:b w:val="0"/>
-          <w:color w:val="16241C"/>
-          <w:sz w:val="21"/>
-        </w:rPr>
-        <w:t xml:space="preserve"> (2016) each tried to aggregate small farms and deliver the food themselves. Each shut the business down.</w:t>
-      </w:r>
-      <w:r>
-        <w:rPr>
-          <w:color w:val="235C3A"/>
-          <w:sz w:val="14"/>
-          <w:vertAlign w:val="superscript"/>
-        </w:rPr>
-        <w:t>6</w:t>
-      </w:r>
-    </w:p>
-    <w:p>
-      <w:pPr>
-        <w:jc w:val="both"/>
-      </w:pPr>
-      <w:r>
-        <w:rPr>
-          <w:b w:val="0"/>
-          <w:color w:val="16241C"/>
-          <w:sz w:val="21"/>
-        </w:rPr>
-        <w:t xml:space="preserve">The reason was the same every time: </w:t>
-      </w:r>
-      <w:r>
-        <w:rPr>
-          <w:b/>
-          <w:color w:val="16241C"/>
-          <w:sz w:val="21"/>
-        </w:rPr>
-        <w:t>they owned the perishable inventory and the logistics.</w:t>
-      </w:r>
-      <w:r>
-        <w:rPr>
-          <w:b w:val="0"/>
-          <w:color w:val="16241C"/>
-          <w:sz w:val="21"/>
-        </w:rPr>
-        <w:t xml:space="preserve"> Warehouses, trucks, and spoilage are cash-intensive and low-margin, and the math gets worse as you add cities. They also sold to consumers, the most price-sensitive buyer, and they expanded geography before the unit economics worked. The large distributors (Sysco, US Foods) serve scale but not small local farms; for them, “local” is a checkbox, not the product.</w:t>
-      </w:r>
-    </w:p>
-    <w:p>
-      <w:pPr>
-        <w:jc w:val="both"/>
-      </w:pPr>
-      <w:r>
-        <w:rPr>
-          <w:b w:val="0"/>
-          <w:color w:val="16241C"/>
-          <w:sz w:val="21"/>
-        </w:rPr>
-        <w:t xml:space="preserve">We are different on every count: we own </w:t>
-      </w:r>
-      <w:r>
-        <w:rPr>
-          <w:b/>
-          <w:color w:val="16241C"/>
-          <w:sz w:val="21"/>
-        </w:rPr>
-        <w:t>no warehouses, trucks, or inventory</w:t>
-      </w:r>
-      <w:r>
-        <w:rPr>
-          <w:b w:val="0"/>
-          <w:color w:val="16241C"/>
-          <w:sz w:val="21"/>
-        </w:rPr>
-        <w:t xml:space="preserve"> (the restaurant funds the food at the farm's price and delivery is third-party at cost); we sell to </w:t>
-      </w:r>
-      <w:r>
-        <w:rPr>
-          <w:b/>
-          <w:color w:val="16241C"/>
-          <w:sz w:val="21"/>
-        </w:rPr>
-        <w:t>restaurants on a recurring fee</w:t>
-      </w:r>
-      <w:r>
-        <w:rPr>
-          <w:b w:val="0"/>
-          <w:color w:val="16241C"/>
-          <w:sz w:val="21"/>
-        </w:rPr>
-        <w:t xml:space="preserve">, not to price-sensitive consumers; we earn </w:t>
-      </w:r>
-      <w:r>
-        <w:rPr>
-          <w:b/>
-          <w:color w:val="16241C"/>
-          <w:sz w:val="21"/>
-        </w:rPr>
-        <w:t>density in one metro</w:t>
-      </w:r>
-      <w:r>
-        <w:rPr>
-          <w:b w:val="0"/>
-          <w:color w:val="16241C"/>
-          <w:sz w:val="21"/>
-        </w:rPr>
-        <w:t xml:space="preserve"> before expanding; and the coordination that made this unprofitable by hand is now run by an </w:t>
-      </w:r>
-      <w:r>
-        <w:rPr>
-          <w:b/>
-          <w:color w:val="16241C"/>
-          <w:sz w:val="21"/>
-        </w:rPr>
-        <w:t>AI agent</w:t>
+        <w:t>built and live today</w:t>
       </w:r>
       <w:r>
         <w:rPr>
@@ -903,21 +393,15 @@
           <w:color w:val="16241C"/>
           <w:sz w:val="21"/>
         </w:rPr>
-        <w:t>Three explicit parts:</w:t>
+        <w:t xml:space="preserve">Our economics are deliberately asset-light, and there are only three parts. </w:t>
       </w:r>
-    </w:p>
-    <w:p>
-      <w:pPr>
-        <w:pStyle w:val="ListBullet"/>
-        <w:spacing w:after="60"/>
-      </w:pPr>
       <w:r>
         <w:rPr>
           <w:b/>
           <w:color w:val="16241C"/>
           <w:sz w:val="21"/>
         </w:rPr>
-        <w:t>Food:</w:t>
+        <w:t>Food</w:t>
       </w:r>
       <w:r>
         <w:rPr>
@@ -925,7 +409,7 @@
           <w:color w:val="16241C"/>
           <w:sz w:val="21"/>
         </w:rPr>
-        <w:t xml:space="preserve"> billed to the restaurant at the farm's price. We make </w:t>
+        <w:t xml:space="preserve"> is billed to the restaurant at the farm's price — we make </w:t>
       </w:r>
       <w:r>
         <w:rPr>
@@ -941,21 +425,15 @@
           <w:color w:val="16241C"/>
           <w:sz w:val="21"/>
         </w:rPr>
-        <w:t xml:space="preserve"> on the food itself.</w:t>
+        <w:t xml:space="preserve"> on it. </w:t>
       </w:r>
-    </w:p>
-    <w:p>
-      <w:pPr>
-        <w:pStyle w:val="ListBullet"/>
-        <w:spacing w:after="60"/>
-      </w:pPr>
       <w:r>
         <w:rPr>
           <w:b/>
           <w:color w:val="16241C"/>
           <w:sz w:val="21"/>
         </w:rPr>
-        <w:t>Delivery:</w:t>
+        <w:t>Delivery</w:t>
       </w:r>
       <w:r>
         <w:rPr>
@@ -963,7 +441,7 @@
           <w:color w:val="16241C"/>
           <w:sz w:val="21"/>
         </w:rPr>
-        <w:t xml:space="preserve"> passed through at third-party cost. We make </w:t>
+        <w:t xml:space="preserve"> is passed through at third-party cost — we make </w:t>
       </w:r>
       <w:r>
         <w:rPr>
@@ -979,21 +457,15 @@
           <w:color w:val="16241C"/>
           <w:sz w:val="21"/>
         </w:rPr>
-        <w:t xml:space="preserve"> on logistics.</w:t>
+        <w:t xml:space="preserve"> on logistics. Our only revenue is a </w:t>
       </w:r>
-    </w:p>
-    <w:p>
-      <w:pPr>
-        <w:pStyle w:val="ListBullet"/>
-        <w:spacing w:after="60"/>
-      </w:pPr>
       <w:r>
         <w:rPr>
           <w:b/>
           <w:color w:val="16241C"/>
           <w:sz w:val="21"/>
         </w:rPr>
-        <w:t>Service fee:</w:t>
+        <w:t>service fee</w:t>
       </w:r>
       <w:r>
         <w:rPr>
@@ -1001,7 +473,7 @@
           <w:color w:val="16241C"/>
           <w:sz w:val="21"/>
         </w:rPr>
-        <w:t xml:space="preserve"> our only revenue. A </w:t>
+        <w:t xml:space="preserve">: a </w:t>
       </w:r>
       <w:r>
         <w:rPr>
@@ -1025,7 +497,7 @@
           <w:color w:val="16241C"/>
           <w:sz w:val="21"/>
         </w:rPr>
-        <w:t>$896</w:t>
+        <w:t>$896 per restaurant per month</w:t>
       </w:r>
       <w:r>
         <w:rPr>
@@ -1033,36 +505,7 @@
           <w:color w:val="16241C"/>
           <w:sz w:val="21"/>
         </w:rPr>
-        <w:t xml:space="preserve"> per restaurant per month (about </w:t>
-      </w:r>
-      <w:r>
-        <w:rPr>
-          <w:b/>
-          <w:color w:val="16241C"/>
-          <w:sz w:val="21"/>
-        </w:rPr>
-        <w:t>$10,700</w:t>
-      </w:r>
-      <w:r>
-        <w:rPr>
-          <w:b w:val="0"/>
-          <w:color w:val="16241C"/>
-          <w:sz w:val="21"/>
-        </w:rPr>
-        <w:t xml:space="preserve"> per year).</w:t>
-      </w:r>
-    </w:p>
-    <w:p>
-      <w:pPr>
-        <w:jc w:val="both"/>
-      </w:pPr>
-      <w:r>
-        <w:rPr>
-          <w:b w:val="0"/>
-          <w:color w:val="16241C"/>
-          <w:sz w:val="21"/>
-        </w:rPr>
-        <w:t xml:space="preserve">Because our costs are software, agent compute, and a thin coordination layer, the service-fee gross margin runs about </w:t>
+        <w:t xml:space="preserve"> (~$10,700/year). Because our costs are software, agent compute, and a thin coordination layer, the service-fee gross margin runs about </w:t>
       </w:r>
       <w:r>
         <w:rPr>
@@ -1078,7 +521,7 @@
           <w:color w:val="16241C"/>
           <w:sz w:val="21"/>
         </w:rPr>
-        <w:t xml:space="preserve">. At ~$896 per month and ~80% margin, a customer contributes about </w:t>
+        <w:t>. At that margin a customer contributes ~</w:t>
       </w:r>
       <w:r>
         <w:rPr>
@@ -1086,7 +529,7 @@
           <w:color w:val="16241C"/>
           <w:sz w:val="21"/>
         </w:rPr>
-        <w:t>$717</w:t>
+        <w:t>$717/month</w:t>
       </w:r>
       <w:r>
         <w:rPr>
@@ -1094,7 +537,7 @@
           <w:color w:val="16241C"/>
           <w:sz w:val="21"/>
         </w:rPr>
-        <w:t xml:space="preserve"> per month, so even a $1,000 acquisition cost pays back in under two months (illustrative).</w:t>
+        <w:t>, so even a $1,000 acquisition cost pays back in under two months (illustrative). We make software margins on a problem others tried to solve with trucks.</w:t>
       </w:r>
     </w:p>
     <w:p>
@@ -1107,21 +550,28 @@
           <w:color w:val="235C3A"/>
           <w:sz w:val="24"/>
         </w:rPr>
-        <w:t>Moat</w:t>
+        <w:t>Go-to-Market</w:t>
       </w:r>
     </w:p>
     <w:p>
       <w:pPr>
-        <w:pStyle w:val="ListBullet"/>
-        <w:spacing w:after="60"/>
+        <w:jc w:val="both"/>
       </w:pPr>
+      <w:r>
+        <w:rPr>
+          <w:b w:val="0"/>
+          <w:color w:val="16241C"/>
+          <w:sz w:val="21"/>
+        </w:rPr>
+        <w:t xml:space="preserve">We win </w:t>
+      </w:r>
       <w:r>
         <w:rPr>
           <w:b/>
           <w:color w:val="16241C"/>
           <w:sz w:val="21"/>
         </w:rPr>
-        <w:t>Two-sided density:</w:t>
+        <w:t>one metro at a time</w:t>
       </w:r>
       <w:r>
         <w:rPr>
@@ -1129,21 +579,15 @@
           <w:color w:val="16241C"/>
           <w:sz w:val="21"/>
         </w:rPr>
-        <w:t xml:space="preserve"> once we vet and contract a city's farms, a new entrant must rebuild the whole local supply base. More restaurants pull more farm capacity; more farms mean better fill.</w:t>
+        <w:t xml:space="preserve"> and earn density before expanding. The motion is a </w:t>
       </w:r>
-    </w:p>
-    <w:p>
-      <w:pPr>
-        <w:pStyle w:val="ListBullet"/>
-        <w:spacing w:after="60"/>
-      </w:pPr>
       <w:r>
         <w:rPr>
           <w:b/>
           <w:color w:val="16241C"/>
           <w:sz w:val="21"/>
         </w:rPr>
-        <w:t>Proprietary data:</w:t>
+        <w:t>part-time industry insider plus warm introductions</w:t>
       </w:r>
       <w:r>
         <w:rPr>
@@ -1151,21 +595,15 @@
           <w:color w:val="16241C"/>
           <w:sz w:val="21"/>
         </w:rPr>
-        <w:t xml:space="preserve"> every contract, delivery, and price trains the agent on local supply, reliability, and demand, so our matching and forecasting beat any generic tool.</w:t>
+        <w:t xml:space="preserve"> into Indianapolis kitchens — a credibility-led, low-CAC channel rather than cold paid acquisition. The wedge is the </w:t>
       </w:r>
-    </w:p>
-    <w:p>
-      <w:pPr>
-        <w:pStyle w:val="ListBullet"/>
-        <w:spacing w:after="60"/>
-      </w:pPr>
       <w:r>
         <w:rPr>
           <w:b/>
           <w:color w:val="16241C"/>
           <w:sz w:val="21"/>
         </w:rPr>
-        <w:t>Switching costs:</w:t>
+        <w:t>free instant audit</w:t>
       </w:r>
       <w:r>
         <w:rPr>
@@ -1173,7 +611,31 @@
           <w:color w:val="16241C"/>
           <w:sz w:val="21"/>
         </w:rPr>
-        <w:t xml:space="preserve"> once we run a kitchen's sourcing, contracts, deliveries, and margins, replacing us means rebuilding their supply chain by hand.</w:t>
+        <w:t xml:space="preserve">: it turns a cold kitchen into a quantified “money on the table” conversation using their own menu, and the free first ingredient removes the risk of trying. We estimate about </w:t>
+      </w:r>
+      <w:r>
+        <w:rPr>
+          <w:b/>
+          <w:color w:val="16241C"/>
+          <w:sz w:val="21"/>
+        </w:rPr>
+        <w:t>1,500 target independents</w:t>
+      </w:r>
+      <w:r>
+        <w:rPr>
+          <w:b w:val="0"/>
+          <w:color w:val="16241C"/>
+          <w:sz w:val="21"/>
+        </w:rPr>
+        <w:t xml:space="preserve"> in the metro.</w:t>
+      </w:r>
+      <w:r>
+        <w:rPr>
+          <w:color w:val="235C3A"/>
+          <w:sz w:val="14"/>
+          <w:vertAlign w:val="superscript"/>
+        </w:rPr>
+        <w:t>5</w:t>
       </w:r>
     </w:p>
     <w:p>
@@ -1186,7 +648,7 @@
           <w:color w:val="235C3A"/>
           <w:sz w:val="24"/>
         </w:rPr>
-        <w:t>Ask</w:t>
+        <w:t>Why We Win</w:t>
       </w:r>
     </w:p>
     <w:p>
@@ -1199,7 +661,381 @@
           <w:color w:val="16241C"/>
           <w:sz w:val="21"/>
         </w:rPr>
-        <w:t xml:space="preserve">The product is built and live; we are </w:t>
+        <w:t xml:space="preserve">Many have tried this and failed, and the cause of death is consistent. </w:t>
+      </w:r>
+      <w:r>
+        <w:rPr>
+          <w:b/>
+          <w:color w:val="16241C"/>
+          <w:sz w:val="21"/>
+        </w:rPr>
+        <w:t>Webvan</w:t>
+      </w:r>
+      <w:r>
+        <w:rPr>
+          <w:b w:val="0"/>
+          <w:color w:val="16241C"/>
+          <w:sz w:val="21"/>
+        </w:rPr>
+        <w:t xml:space="preserve"> raised more than </w:t>
+      </w:r>
+      <w:r>
+        <w:rPr>
+          <w:b/>
+          <w:color w:val="16241C"/>
+          <w:sz w:val="21"/>
+        </w:rPr>
+        <w:t>$800M</w:t>
+      </w:r>
+      <w:r>
+        <w:rPr>
+          <w:b w:val="0"/>
+          <w:color w:val="16241C"/>
+          <w:sz w:val="21"/>
+        </w:rPr>
+        <w:t>, built its own warehouses and trucks, expanded city by city, and went bankrupt in 2001.</w:t>
+      </w:r>
+      <w:r>
+        <w:rPr>
+          <w:color w:val="235C3A"/>
+          <w:sz w:val="14"/>
+          <w:vertAlign w:val="superscript"/>
+        </w:rPr>
+        <w:t>6</w:t>
+      </w:r>
+      <w:r>
+        <w:rPr>
+          <w:b w:val="0"/>
+          <w:color w:val="16241C"/>
+          <w:sz w:val="21"/>
+        </w:rPr>
+        <w:t xml:space="preserve"> </w:t>
+      </w:r>
+      <w:r>
+        <w:rPr>
+          <w:b/>
+          <w:color w:val="16241C"/>
+          <w:sz w:val="21"/>
+        </w:rPr>
+        <w:t>Good Eggs</w:t>
+      </w:r>
+      <w:r>
+        <w:rPr>
+          <w:b w:val="0"/>
+          <w:color w:val="16241C"/>
+          <w:sz w:val="21"/>
+        </w:rPr>
+        <w:t xml:space="preserve"> raised ~$50M, scaled to four cities, and in 2015 retreated to one.</w:t>
+      </w:r>
+      <w:r>
+        <w:rPr>
+          <w:color w:val="235C3A"/>
+          <w:sz w:val="14"/>
+          <w:vertAlign w:val="superscript"/>
+        </w:rPr>
+        <w:t>6</w:t>
+      </w:r>
+      <w:r>
+        <w:rPr>
+          <w:b w:val="0"/>
+          <w:color w:val="16241C"/>
+          <w:sz w:val="21"/>
+        </w:rPr>
+        <w:t xml:space="preserve"> </w:t>
+      </w:r>
+      <w:r>
+        <w:rPr>
+          <w:b/>
+          <w:color w:val="16241C"/>
+          <w:sz w:val="21"/>
+        </w:rPr>
+        <w:t>Farmigo</w:t>
+      </w:r>
+      <w:r>
+        <w:rPr>
+          <w:b w:val="0"/>
+          <w:color w:val="16241C"/>
+          <w:sz w:val="21"/>
+        </w:rPr>
+        <w:t xml:space="preserve">, </w:t>
+      </w:r>
+      <w:r>
+        <w:rPr>
+          <w:b/>
+          <w:color w:val="16241C"/>
+          <w:sz w:val="21"/>
+        </w:rPr>
+        <w:t>Door to Door Organics</w:t>
+      </w:r>
+      <w:r>
+        <w:rPr>
+          <w:b w:val="0"/>
+          <w:color w:val="16241C"/>
+          <w:sz w:val="21"/>
+        </w:rPr>
+        <w:t xml:space="preserve">, and </w:t>
+      </w:r>
+      <w:r>
+        <w:rPr>
+          <w:b/>
+          <w:color w:val="16241C"/>
+          <w:sz w:val="21"/>
+        </w:rPr>
+        <w:t>Relay Foods</w:t>
+      </w:r>
+      <w:r>
+        <w:rPr>
+          <w:b w:val="0"/>
+          <w:color w:val="16241C"/>
+          <w:sz w:val="21"/>
+        </w:rPr>
+        <w:t xml:space="preserve"> each tried to aggregate small farms and deliver, and each shut down by 2016.</w:t>
+      </w:r>
+      <w:r>
+        <w:rPr>
+          <w:color w:val="235C3A"/>
+          <w:sz w:val="14"/>
+          <w:vertAlign w:val="superscript"/>
+        </w:rPr>
+        <w:t>6</w:t>
+      </w:r>
+      <w:r>
+        <w:rPr>
+          <w:b w:val="0"/>
+          <w:color w:val="16241C"/>
+          <w:sz w:val="21"/>
+        </w:rPr>
+        <w:t xml:space="preserve"> They </w:t>
+      </w:r>
+      <w:r>
+        <w:rPr>
+          <w:b/>
+          <w:color w:val="16241C"/>
+          <w:sz w:val="21"/>
+        </w:rPr>
+        <w:t>owned the perishable inventory and the logistics</w:t>
+      </w:r>
+      <w:r>
+        <w:rPr>
+          <w:b w:val="0"/>
+          <w:color w:val="16241C"/>
+          <w:sz w:val="21"/>
+        </w:rPr>
+        <w:t>, sold to price-sensitive consumers, and expanded geography before the unit economics worked. Large distributors (Sysco, US Foods) serve scale but not small local farms; for them, “local” is a checkbox.</w:t>
+      </w:r>
+    </w:p>
+    <w:p>
+      <w:pPr>
+        <w:jc w:val="both"/>
+      </w:pPr>
+      <w:r>
+        <w:rPr>
+          <w:b w:val="0"/>
+          <w:color w:val="16241C"/>
+          <w:sz w:val="21"/>
+        </w:rPr>
+        <w:t xml:space="preserve">We are different on every count, and the advantage compounds. We own </w:t>
+      </w:r>
+      <w:r>
+        <w:rPr>
+          <w:b/>
+          <w:color w:val="16241C"/>
+          <w:sz w:val="21"/>
+        </w:rPr>
+        <w:t>no warehouses, trucks, or inventory</w:t>
+      </w:r>
+      <w:r>
+        <w:rPr>
+          <w:b w:val="0"/>
+          <w:color w:val="16241C"/>
+          <w:sz w:val="21"/>
+        </w:rPr>
+        <w:t xml:space="preserve">; we sell to </w:t>
+      </w:r>
+      <w:r>
+        <w:rPr>
+          <w:b/>
+          <w:color w:val="16241C"/>
+          <w:sz w:val="21"/>
+        </w:rPr>
+        <w:t>restaurants on a recurring fee</w:t>
+      </w:r>
+      <w:r>
+        <w:rPr>
+          <w:b w:val="0"/>
+          <w:color w:val="16241C"/>
+          <w:sz w:val="21"/>
+        </w:rPr>
+        <w:t xml:space="preserve">; we earn </w:t>
+      </w:r>
+      <w:r>
+        <w:rPr>
+          <w:b/>
+          <w:color w:val="16241C"/>
+          <w:sz w:val="21"/>
+        </w:rPr>
+        <w:t>density in one metro</w:t>
+      </w:r>
+      <w:r>
+        <w:rPr>
+          <w:b w:val="0"/>
+          <w:color w:val="16241C"/>
+          <w:sz w:val="21"/>
+        </w:rPr>
+        <w:t xml:space="preserve"> first; and an </w:t>
+      </w:r>
+      <w:r>
+        <w:rPr>
+          <w:b/>
+          <w:color w:val="16241C"/>
+          <w:sz w:val="21"/>
+        </w:rPr>
+        <w:t>AI agent</w:t>
+      </w:r>
+      <w:r>
+        <w:rPr>
+          <w:b w:val="0"/>
+          <w:color w:val="16241C"/>
+          <w:sz w:val="21"/>
+        </w:rPr>
+        <w:t xml:space="preserve"> runs the coordination that made this unprofitable by hand. That density is the moat: vet a city's farms once and a rival must rebuild the whole local supply base. Every contract, delivery, and price also </w:t>
+      </w:r>
+      <w:r>
+        <w:rPr>
+          <w:b/>
+          <w:color w:val="16241C"/>
+          <w:sz w:val="21"/>
+        </w:rPr>
+        <w:t>trains the agent</w:t>
+      </w:r>
+      <w:r>
+        <w:rPr>
+          <w:b w:val="0"/>
+          <w:color w:val="16241C"/>
+          <w:sz w:val="21"/>
+        </w:rPr>
+        <w:t xml:space="preserve"> on local supply and demand, and once we run a kitchen's sourcing, contracts, and deliveries, </w:t>
+      </w:r>
+      <w:r>
+        <w:rPr>
+          <w:b/>
+          <w:color w:val="16241C"/>
+          <w:sz w:val="21"/>
+        </w:rPr>
+        <w:t>replacing us means rebuilding their supply chain by hand</w:t>
+      </w:r>
+      <w:r>
+        <w:rPr>
+          <w:b w:val="0"/>
+          <w:color w:val="16241C"/>
+          <w:sz w:val="21"/>
+        </w:rPr>
+        <w:t>.</w:t>
+      </w:r>
+    </w:p>
+    <w:p>
+      <w:pPr>
+        <w:spacing w:before="220" w:after="60"/>
+      </w:pPr>
+      <w:r>
+        <w:rPr>
+          <w:b/>
+          <w:color w:val="235C3A"/>
+          <w:sz w:val="24"/>
+        </w:rPr>
+        <w:t>Team</w:t>
+      </w:r>
+    </w:p>
+    <w:p>
+      <w:pPr>
+        <w:jc w:val="both"/>
+      </w:pPr>
+      <w:r>
+        <w:rPr>
+          <w:b/>
+          <w:color w:val="16241C"/>
+          <w:sz w:val="21"/>
+        </w:rPr>
+        <w:t>Keshav Krishnan</w:t>
+      </w:r>
+      <w:r>
+        <w:rPr>
+          <w:b w:val="0"/>
+          <w:color w:val="16241C"/>
+          <w:sz w:val="21"/>
+        </w:rPr>
+        <w:t xml:space="preserve">, founder. [Add one or two lines on your relevant background: industry exposure, technical build of the product, and any prior ventures.] Early sales are led by a </w:t>
+      </w:r>
+      <w:r>
+        <w:rPr>
+          <w:b/>
+          <w:color w:val="16241C"/>
+          <w:sz w:val="21"/>
+        </w:rPr>
+        <w:t>part-time industry insider</w:t>
+      </w:r>
+      <w:r>
+        <w:rPr>
+          <w:b w:val="0"/>
+          <w:color w:val="16241C"/>
+          <w:sz w:val="21"/>
+        </w:rPr>
+        <w:t xml:space="preserve"> with existing restaurant relationships in the market.</w:t>
+      </w:r>
+    </w:p>
+    <w:p>
+      <w:pPr>
+        <w:spacing w:after="80"/>
+      </w:pPr>
+      <w:r>
+        <w:rPr>
+          <w:b w:val="0"/>
+          <w:color w:val="5B6B60"/>
+          <w:sz w:val="19"/>
+        </w:rPr>
+        <w:t>To complete before sending: founder background, and the insider's name/relationships.</w:t>
+      </w:r>
+    </w:p>
+    <w:p>
+      <w:pPr>
+        <w:spacing w:before="220" w:after="60"/>
+      </w:pPr>
+      <w:r>
+        <w:rPr>
+          <w:b/>
+          <w:color w:val="235C3A"/>
+          <w:sz w:val="24"/>
+        </w:rPr>
+        <w:t>Status and Ask</w:t>
+      </w:r>
+    </w:p>
+    <w:p>
+      <w:pPr>
+        <w:jc w:val="both"/>
+      </w:pPr>
+      <w:r>
+        <w:rPr>
+          <w:b w:val="0"/>
+          <w:color w:val="16241C"/>
+          <w:sz w:val="21"/>
+        </w:rPr>
+        <w:t xml:space="preserve">The product is </w:t>
+      </w:r>
+      <w:r>
+        <w:rPr>
+          <w:b/>
+          <w:color w:val="16241C"/>
+          <w:sz w:val="21"/>
+        </w:rPr>
+        <w:t>built and live</w:t>
+      </w:r>
+      <w:r>
+        <w:rPr>
+          <w:b w:val="0"/>
+          <w:color w:val="16241C"/>
+          <w:sz w:val="21"/>
+        </w:rPr>
+        <w:t xml:space="preserve">; we are </w:t>
       </w:r>
       <w:r>
         <w:rPr>
@@ -1263,7 +1099,7 @@
           <w:color w:val="16241C"/>
           <w:sz w:val="21"/>
         </w:rPr>
-        <w:t xml:space="preserve"> discount, MFN). About </w:t>
+        <w:t xml:space="preserve"> discount, MFN), with about </w:t>
       </w:r>
       <w:r>
         <w:rPr>
@@ -1279,7 +1115,7 @@
           <w:color w:val="16241C"/>
           <w:sz w:val="21"/>
         </w:rPr>
-        <w:t xml:space="preserve"> of the round goes to sales. It funds one milestone: </w:t>
+        <w:t xml:space="preserve"> going to sales. The round funds one milestone: </w:t>
       </w:r>
       <w:r>
         <w:rPr>
@@ -1287,7 +1123,7 @@
           <w:color w:val="16241C"/>
           <w:sz w:val="21"/>
         </w:rPr>
-        <w:t>15 paying kitchens and about $13,000 in monthly recurring revenue in Indianapolis within 90 days</w:t>
+        <w:t>15 paying kitchens and ~$13,000 in monthly recurring revenue in Indianapolis within 90 days</w:t>
       </w:r>
       <w:r>
         <w:rPr>
@@ -1300,6 +1136,151 @@
     </w:p>
     <w:p>
       <w:pPr>
+        <w:spacing w:before="220" w:after="60"/>
+      </w:pPr>
+      <w:r>
+        <w:rPr>
+          <w:b/>
+          <w:color w:val="235C3A"/>
+          <w:sz w:val="24"/>
+        </w:rPr>
+        <w:t>Risks and Open Questions</w:t>
+      </w:r>
+    </w:p>
+    <w:p>
+      <w:pPr>
+        <w:pStyle w:val="ListBullet"/>
+        <w:spacing w:after="60"/>
+      </w:pPr>
+      <w:r>
+        <w:rPr>
+          <w:b/>
+          <w:color w:val="16241C"/>
+          <w:sz w:val="21"/>
+        </w:rPr>
+        <w:t>Willingness to pay is unproven.</w:t>
+      </w:r>
+      <w:r>
+        <w:rPr>
+          <w:b w:val="0"/>
+          <w:color w:val="16241C"/>
+          <w:sz w:val="21"/>
+        </w:rPr>
+        <w:t xml:space="preserve"> Being pre-revenue, we have not yet confirmed a restaurant will pay ~$896/month. Mitigation: the free audit quantifies ROI before they pay, and a guarantee backs it.</w:t>
+      </w:r>
+    </w:p>
+    <w:p>
+      <w:pPr>
+        <w:pStyle w:val="ListBullet"/>
+        <w:spacing w:after="60"/>
+      </w:pPr>
+      <w:r>
+        <w:rPr>
+          <w:b/>
+          <w:color w:val="16241C"/>
+          <w:sz w:val="21"/>
+        </w:rPr>
+        <w:t>Acquisition is unproven.</w:t>
+      </w:r>
+      <w:r>
+        <w:rPr>
+          <w:b w:val="0"/>
+          <w:color w:val="16241C"/>
+          <w:sz w:val="21"/>
+        </w:rPr>
+        <w:t xml:space="preserve"> Restaurants are slow, low-tech buyers; the insider/warm-intro motion may not scale cheaply. Mitigation: start where introductions exist and measure CAC and sales-cycle from the first cohort.</w:t>
+      </w:r>
+    </w:p>
+    <w:p>
+      <w:pPr>
+        <w:pStyle w:val="ListBullet"/>
+        <w:spacing w:after="60"/>
+      </w:pPr>
+      <w:r>
+        <w:rPr>
+          <w:b/>
+          <w:color w:val="16241C"/>
+          <w:sz w:val="21"/>
+        </w:rPr>
+        <w:t>Operational reliability.</w:t>
+      </w:r>
+      <w:r>
+        <w:rPr>
+          <w:b w:val="0"/>
+          <w:color w:val="16241C"/>
+          <w:sz w:val="21"/>
+        </w:rPr>
+        <w:t xml:space="preserve"> A single missed delivery breaks trust, and coordinating perishable weekly supply is hard even asset-light. Mitigation: a backup farm stands by for every crop; escrow aligns the farm's incentive to deliver.</w:t>
+      </w:r>
+    </w:p>
+    <w:p>
+      <w:pPr>
+        <w:pStyle w:val="ListBullet"/>
+        <w:spacing w:after="60"/>
+      </w:pPr>
+      <w:r>
+        <w:rPr>
+          <w:b/>
+          <w:color w:val="16241C"/>
+          <w:sz w:val="21"/>
+        </w:rPr>
+        <w:t>Churn.</w:t>
+      </w:r>
+      <w:r>
+        <w:rPr>
+          <w:b w:val="0"/>
+          <w:color w:val="16241C"/>
+          <w:sz w:val="21"/>
+        </w:rPr>
+        <w:t xml:space="preserve"> Independent restaurants close often and run thin. Mitigation: deep switching costs once we are embedded in their sourcing and contracts.</w:t>
+      </w:r>
+    </w:p>
+    <w:p>
+      <w:pPr>
+        <w:pStyle w:val="ListBullet"/>
+        <w:spacing w:after="60"/>
+      </w:pPr>
+      <w:r>
+        <w:rPr>
+          <w:b/>
+          <w:color w:val="16241C"/>
+          <w:sz w:val="21"/>
+        </w:rPr>
+        <w:t>Cold start / density.</w:t>
+      </w:r>
+      <w:r>
+        <w:rPr>
+          <w:b w:val="0"/>
+          <w:color w:val="16241C"/>
+          <w:sz w:val="21"/>
+        </w:rPr>
+        <w:t xml:space="preserve"> The flywheel needs both farms and restaurants in a metro. Mitigation: seed the farm side first and stay in one metro until it is dense.</w:t>
+      </w:r>
+    </w:p>
+    <w:p>
+      <w:pPr>
+        <w:pStyle w:val="ListBullet"/>
+        <w:spacing w:after="60"/>
+      </w:pPr>
+      <w:r>
+        <w:rPr>
+          <w:b/>
+          <w:color w:val="16241C"/>
+          <w:sz w:val="21"/>
+        </w:rPr>
+        <w:t>Team depth.</w:t>
+      </w:r>
+      <w:r>
+        <w:rPr>
+          <w:b w:val="0"/>
+          <w:color w:val="16241C"/>
+          <w:sz w:val="21"/>
+        </w:rPr>
+        <w:t xml:space="preserve"> A small team is key-person risk. Mitigation: this round funds the first dedicated sales hire.</w:t>
+      </w:r>
+    </w:p>
+    <w:p>
+      <w:pPr>
         <w:spacing w:before="280"/>
       </w:pPr>
       <w:r>
@@ -1308,7 +1289,7 @@
           <w:color w:val="5B6B60"/>
           <w:sz w:val="17"/>
         </w:rPr>
-        <w:t>Sources.  1 — Restaurant net-margin and prime-cost benchmarks: National Restaurant Association; Restaurant365 industry benchmarks.  2 — National Restaurant Association, 2022 State of the Restaurant Industry.  3 — FMI, transparency and foodservice trends, 2023.  4 — National Restaurant Association, 2024 industry forecast.  5 — Indianapolis restaurant counts and revenue opportunity are internal estimates.  6 — Company outcomes are publicly reported: Webvan (bankruptcy, 2001); Good Eggs (layoffs and market exit, 2015); Farmigo, Door to Door Organics, and Relay Foods (ceased food operations, 2016).</w:t>
+        <w:t>Sources.  1 — Restaurant net-margin and prime-cost benchmarks: National Restaurant Association; Restaurant365 industry benchmarks.  2 — National Restaurant Association, 2022 State of the Restaurant Industry.  3 — FMI, transparency and foodservice trends, 2023.  4 — National Restaurant Association, 2024 industry forecast.  5 — Indianapolis restaurant counts and target-segment figures are internal estimates.  6 — Company outcomes are publicly reported: Webvan (bankruptcy, 2001); Good Eggs (layoffs and market exit, 2015); Farmigo, Door to Door Organics, and Relay Foods (ceased food operations, 2016).</w:t>
       </w:r>
     </w:p>
     <w:p>

</xml_diff>

<commit_message>
docs: pre-read — drop slogan contrasts, add explicit Unit Economics block, make GTM a concrete phased strategy
</commit_message>
<xml_diff>
--- a/pitch/cropconnect-preread.docx
+++ b/pitch/cropconnect-preread.docx
@@ -38,7 +38,7 @@
           <w:color w:val="16241C"/>
           <w:sz w:val="21"/>
         </w:rPr>
-        <w:t xml:space="preserve">CropConnect is an AI agent that runs local sourcing for restaurants end to end: it finds the farms, signs the contracts, runs weekly delivery, holds payment in escrow, and tracks the added margin. The owner does two things — ask, and put the dish on the menu. Diners increasingly choose restaurants for local food, but sourcing it by hand is a second full-time job, so most independents skip it; an AI agent makes that work cheap enough to do for them. The product is built and live. We are </w:t>
+        <w:t xml:space="preserve">CropConnect is an AI agent that runs local sourcing for restaurants end to end: it finds the farms, signs the contracts, runs weekly delivery, holds payment in escrow, and tracks the added margin. The owner names an ingredient and puts the dish on the menu; the agent does the rest. Diners increasingly choose restaurants for local food, while sourcing it by hand remains a second full-time job most independents skip. The product is built and live. We are </w:t>
       </w:r>
       <w:r>
         <w:rPr>
@@ -160,7 +160,7 @@
           <w:color w:val="16241C"/>
           <w:sz w:val="21"/>
         </w:rPr>
-        <w:t xml:space="preserve"> There is little to cut, so growth has to come from charging more for the same seats. Local sourcing is how kitchens do that: </w:t>
+        <w:t xml:space="preserve"> Most growth therefore has to come from charging more for the same seats, and local sourcing is a proven way to do it: </w:t>
       </w:r>
       <w:r>
         <w:rPr>
@@ -192,7 +192,7 @@
           <w:color w:val="16241C"/>
           <w:sz w:val="21"/>
         </w:rPr>
-        <w:t xml:space="preserve"> and </w:t>
+        <w:t xml:space="preserve"> </w:t>
       </w:r>
       <w:r>
         <w:rPr>
@@ -208,7 +208,7 @@
           <w:color w:val="16241C"/>
           <w:sz w:val="21"/>
         </w:rPr>
-        <w:t xml:space="preserve"> want the story behind what they eat;</w:t>
+        <w:t xml:space="preserve"> want the story behind their food,</w:t>
       </w:r>
       <w:r>
         <w:rPr>
@@ -224,7 +224,7 @@
           <w:color w:val="16241C"/>
           <w:sz w:val="21"/>
         </w:rPr>
-        <w:t xml:space="preserve"> the share rating ingredient transparency as important rose from </w:t>
+        <w:t xml:space="preserve"> and the share rating ingredient transparency as important rose from </w:t>
       </w:r>
       <w:r>
         <w:rPr>
@@ -256,7 +256,7 @@
           <w:color w:val="16241C"/>
           <w:sz w:val="21"/>
         </w:rPr>
-        <w:t xml:space="preserve"> The barrier is labor, not demand — doing it by hand means finding farms, vetting them, negotiating, contracting, scheduling, and covering shortfalls.</w:t>
+        <w:t xml:space="preserve"> Sourcing locally by hand means finding farms, vetting them, negotiating, contracting, scheduling, and covering shortfalls, so most independents do not.</w:t>
       </w:r>
     </w:p>
     <w:p>
@@ -269,7 +269,7 @@
           <w:color w:val="16241C"/>
           <w:sz w:val="21"/>
         </w:rPr>
-        <w:t xml:space="preserve">Two things just became true at once: durable diner demand for local, and AI agents finally cheap enough to run that coordination as a done-for-you service. The market is large — U.S. restaurants did about </w:t>
+        <w:t xml:space="preserve">Durable diner demand for local and AI agents cheap enough to run that coordination as a service have arrived together for the first time. The U.S. restaurant market is large: about </w:t>
       </w:r>
       <w:r>
         <w:rPr>
@@ -393,87 +393,7 @@
           <w:color w:val="16241C"/>
           <w:sz w:val="21"/>
         </w:rPr>
-        <w:t xml:space="preserve">Our economics are deliberately asset-light, and there are only three parts. </w:t>
-      </w:r>
-      <w:r>
-        <w:rPr>
-          <w:b/>
-          <w:color w:val="16241C"/>
-          <w:sz w:val="21"/>
-        </w:rPr>
-        <w:t>Food</w:t>
-      </w:r>
-      <w:r>
-        <w:rPr>
-          <w:b w:val="0"/>
-          <w:color w:val="16241C"/>
-          <w:sz w:val="21"/>
-        </w:rPr>
-        <w:t xml:space="preserve"> is billed to the restaurant at the farm's price — we make </w:t>
-      </w:r>
-      <w:r>
-        <w:rPr>
-          <w:b/>
-          <w:color w:val="16241C"/>
-          <w:sz w:val="21"/>
-        </w:rPr>
-        <w:t>$0</w:t>
-      </w:r>
-      <w:r>
-        <w:rPr>
-          <w:b w:val="0"/>
-          <w:color w:val="16241C"/>
-          <w:sz w:val="21"/>
-        </w:rPr>
-        <w:t xml:space="preserve"> on it. </w:t>
-      </w:r>
-      <w:r>
-        <w:rPr>
-          <w:b/>
-          <w:color w:val="16241C"/>
-          <w:sz w:val="21"/>
-        </w:rPr>
-        <w:t>Delivery</w:t>
-      </w:r>
-      <w:r>
-        <w:rPr>
-          <w:b w:val="0"/>
-          <w:color w:val="16241C"/>
-          <w:sz w:val="21"/>
-        </w:rPr>
-        <w:t xml:space="preserve"> is passed through at third-party cost — we make </w:t>
-      </w:r>
-      <w:r>
-        <w:rPr>
-          <w:b/>
-          <w:color w:val="16241C"/>
-          <w:sz w:val="21"/>
-        </w:rPr>
-        <w:t>$0</w:t>
-      </w:r>
-      <w:r>
-        <w:rPr>
-          <w:b w:val="0"/>
-          <w:color w:val="16241C"/>
-          <w:sz w:val="21"/>
-        </w:rPr>
-        <w:t xml:space="preserve"> on logistics. Our only revenue is a </w:t>
-      </w:r>
-      <w:r>
-        <w:rPr>
-          <w:b/>
-          <w:color w:val="16241C"/>
-          <w:sz w:val="21"/>
-        </w:rPr>
-        <w:t>service fee</w:t>
-      </w:r>
-      <w:r>
-        <w:rPr>
-          <w:b w:val="0"/>
-          <w:color w:val="16241C"/>
-          <w:sz w:val="21"/>
-        </w:rPr>
-        <w:t xml:space="preserve">: a </w:t>
+        <w:t xml:space="preserve">Revenue comes only from a monthly service fee. The food is billed to the restaurant at the farm's price and delivery is contracted to third parties at cost, so both pass through with no markup. The service fee is a </w:t>
       </w:r>
       <w:r>
         <w:rPr>
@@ -489,7 +409,7 @@
           <w:color w:val="16241C"/>
           <w:sz w:val="21"/>
         </w:rPr>
-        <w:t xml:space="preserve"> monthly base plus a per-item fee that scales with volume, blending to about </w:t>
+        <w:t xml:space="preserve"> base plus a per-item fee that scales with volume, blending to about </w:t>
       </w:r>
       <w:r>
         <w:rPr>
@@ -505,15 +425,47 @@
           <w:color w:val="16241C"/>
           <w:sz w:val="21"/>
         </w:rPr>
-        <w:t xml:space="preserve"> (~$10,700/year). Because our costs are software, agent compute, and a thin coordination layer, the service-fee gross margin runs about </w:t>
+        <w:t xml:space="preserve"> (~$10,700 per year). Our own costs are software, agent compute, and a thin coordination layer.</w:t>
       </w:r>
+    </w:p>
+    <w:p>
+      <w:pPr>
+        <w:spacing w:before="220" w:after="60"/>
+      </w:pPr>
+      <w:r>
+        <w:rPr>
+          <w:b/>
+          <w:color w:val="235C3A"/>
+          <w:sz w:val="24"/>
+        </w:rPr>
+        <w:t>Unit Economics</w:t>
+      </w:r>
+    </w:p>
+    <w:p>
+      <w:pPr>
+        <w:jc w:val="both"/>
+      </w:pPr>
+      <w:r>
+        <w:rPr>
+          <w:b w:val="0"/>
+          <w:color w:val="16241C"/>
+          <w:sz w:val="21"/>
+        </w:rPr>
+        <w:t>Targets and assumptions below; we are pre-revenue and will replace them with measured numbers from the first cohort.</w:t>
+      </w:r>
+    </w:p>
+    <w:p>
+      <w:pPr>
+        <w:pStyle w:val="ListBullet"/>
+        <w:spacing w:after="60"/>
+      </w:pPr>
       <w:r>
         <w:rPr>
           <w:b/>
           <w:color w:val="16241C"/>
           <w:sz w:val="21"/>
         </w:rPr>
-        <w:t>80% at scale</w:t>
+        <w:t>ARPA:</w:t>
       </w:r>
       <w:r>
         <w:rPr>
@@ -521,7 +473,29 @@
           <w:color w:val="16241C"/>
           <w:sz w:val="21"/>
         </w:rPr>
-        <w:t>. At that margin a customer contributes ~</w:t>
+        <w:t xml:space="preserve"> ~$896/month (~$10,700/year), starting near $400 on the first ingredient and rising as items are added.</w:t>
+      </w:r>
+    </w:p>
+    <w:p>
+      <w:pPr>
+        <w:pStyle w:val="ListBullet"/>
+        <w:spacing w:after="60"/>
+      </w:pPr>
+      <w:r>
+        <w:rPr>
+          <w:b/>
+          <w:color w:val="16241C"/>
+          <w:sz w:val="21"/>
+        </w:rPr>
+        <w:t>Gross margin:</w:t>
+      </w:r>
+      <w:r>
+        <w:rPr>
+          <w:b w:val="0"/>
+          <w:color w:val="16241C"/>
+          <w:sz w:val="21"/>
+        </w:rPr>
+        <w:t xml:space="preserve"> ~80% at scale, or about </w:t>
       </w:r>
       <w:r>
         <w:rPr>
@@ -537,7 +511,127 @@
           <w:color w:val="16241C"/>
           <w:sz w:val="21"/>
         </w:rPr>
-        <w:t>, so even a $1,000 acquisition cost pays back in under two months (illustrative). We make software margins on a problem others tried to solve with trucks.</w:t>
+        <w:t xml:space="preserve"> of gross profit per restaurant.</w:t>
+      </w:r>
+    </w:p>
+    <w:p>
+      <w:pPr>
+        <w:pStyle w:val="ListBullet"/>
+        <w:spacing w:after="60"/>
+      </w:pPr>
+      <w:r>
+        <w:rPr>
+          <w:b/>
+          <w:color w:val="16241C"/>
+          <w:sz w:val="21"/>
+        </w:rPr>
+        <w:t>CAC target:</w:t>
+      </w:r>
+      <w:r>
+        <w:rPr>
+          <w:b w:val="0"/>
+          <w:color w:val="16241C"/>
+          <w:sz w:val="21"/>
+        </w:rPr>
+        <w:t xml:space="preserve"> </w:t>
+      </w:r>
+      <w:r>
+        <w:rPr>
+          <w:b/>
+          <w:color w:val="16241C"/>
+          <w:sz w:val="21"/>
+        </w:rPr>
+        <w:t>$800–$1,200</w:t>
+      </w:r>
+      <w:r>
+        <w:rPr>
+          <w:b w:val="0"/>
+          <w:color w:val="16241C"/>
+          <w:sz w:val="21"/>
+        </w:rPr>
+        <w:t xml:space="preserve"> (insider commission, one onboarding visit, tasting samples).</w:t>
+      </w:r>
+    </w:p>
+    <w:p>
+      <w:pPr>
+        <w:pStyle w:val="ListBullet"/>
+        <w:spacing w:after="60"/>
+      </w:pPr>
+      <w:r>
+        <w:rPr>
+          <w:b/>
+          <w:color w:val="16241C"/>
+          <w:sz w:val="21"/>
+        </w:rPr>
+        <w:t>Payback:</w:t>
+      </w:r>
+      <w:r>
+        <w:rPr>
+          <w:b w:val="0"/>
+          <w:color w:val="16241C"/>
+          <w:sz w:val="21"/>
+        </w:rPr>
+        <w:t xml:space="preserve"> about </w:t>
+      </w:r>
+      <w:r>
+        <w:rPr>
+          <w:b/>
+          <w:color w:val="16241C"/>
+          <w:sz w:val="21"/>
+        </w:rPr>
+        <w:t>1–2 months</w:t>
+      </w:r>
+      <w:r>
+        <w:rPr>
+          <w:b w:val="0"/>
+          <w:color w:val="16241C"/>
+          <w:sz w:val="21"/>
+        </w:rPr>
+        <w:t>.</w:t>
+      </w:r>
+    </w:p>
+    <w:p>
+      <w:pPr>
+        <w:pStyle w:val="ListBullet"/>
+        <w:spacing w:after="60"/>
+      </w:pPr>
+      <w:r>
+        <w:rPr>
+          <w:b/>
+          <w:color w:val="16241C"/>
+          <w:sz w:val="21"/>
+        </w:rPr>
+        <w:t>Assumed monthly logo churn:</w:t>
+      </w:r>
+      <w:r>
+        <w:rPr>
+          <w:b w:val="0"/>
+          <w:color w:val="16241C"/>
+          <w:sz w:val="21"/>
+        </w:rPr>
+        <w:t xml:space="preserve"> ~3% (roughly a 30-month average customer life), reflecting normal restaurant turnover.</w:t>
+      </w:r>
+    </w:p>
+    <w:p>
+      <w:pPr>
+        <w:pStyle w:val="ListBullet"/>
+        <w:spacing w:after="60"/>
+      </w:pPr>
+      <w:r>
+        <w:rPr>
+          <w:b/>
+          <w:color w:val="16241C"/>
+          <w:sz w:val="21"/>
+        </w:rPr>
+        <w:t>Implied LTV (gross profit):</w:t>
+      </w:r>
+      <w:r>
+        <w:rPr>
+          <w:b w:val="0"/>
+          <w:color w:val="16241C"/>
+          <w:sz w:val="21"/>
+        </w:rPr>
+        <w:t xml:space="preserve"> ~$20,000+, for an LTV/CAC well above 10× if these hold.</w:t>
       </w:r>
     </w:p>
     <w:p>
@@ -563,7 +657,152 @@
           <w:color w:val="16241C"/>
           <w:sz w:val="21"/>
         </w:rPr>
-        <w:t xml:space="preserve">We win </w:t>
+        <w:t>We win one metro at a time and earn density before expanding. The Indianapolis plan is specific:</w:t>
+      </w:r>
+    </w:p>
+    <w:p>
+      <w:pPr>
+        <w:pStyle w:val="ListBullet"/>
+        <w:spacing w:after="60"/>
+      </w:pPr>
+      <w:r>
+        <w:rPr>
+          <w:b/>
+          <w:color w:val="16241C"/>
+          <w:sz w:val="21"/>
+        </w:rPr>
+        <w:t>Supply first.</w:t>
+      </w:r>
+      <w:r>
+        <w:rPr>
+          <w:b w:val="0"/>
+          <w:color w:val="16241C"/>
+          <w:sz w:val="21"/>
+        </w:rPr>
+        <w:t xml:space="preserve"> Pre-sign 8–12 vetted local farms across the core crops so fill is guaranteed before we sell a single restaurant. This removes the cold-start problem.</w:t>
+      </w:r>
+    </w:p>
+    <w:p>
+      <w:pPr>
+        <w:pStyle w:val="ListBullet"/>
+        <w:spacing w:after="60"/>
+      </w:pPr>
+      <w:r>
+        <w:rPr>
+          <w:b/>
+          <w:color w:val="16241C"/>
+          <w:sz w:val="21"/>
+        </w:rPr>
+        <w:t>Target list.</w:t>
+      </w:r>
+      <w:r>
+        <w:rPr>
+          <w:b w:val="0"/>
+          <w:color w:val="16241C"/>
+          <w:sz w:val="21"/>
+        </w:rPr>
+        <w:t xml:space="preserve"> A part-time industry insider builds a list of ~150 chef-driven independent restaurants most likely to value local sourcing, drawn from existing relationships.</w:t>
+      </w:r>
+    </w:p>
+    <w:p>
+      <w:pPr>
+        <w:pStyle w:val="ListBullet"/>
+        <w:spacing w:after="60"/>
+      </w:pPr>
+      <w:r>
+        <w:rPr>
+          <w:b/>
+          <w:color w:val="16241C"/>
+          <w:sz w:val="21"/>
+        </w:rPr>
+        <w:t>Outreach.</w:t>
+      </w:r>
+      <w:r>
+        <w:rPr>
+          <w:b w:val="0"/>
+          <w:color w:val="16241C"/>
+          <w:sz w:val="21"/>
+        </w:rPr>
+        <w:t xml:space="preserve"> Before each conversation we run the free audit on the prospect's public menu and bring a specific, quantified estimate of the margin they are leaving behind.</w:t>
+      </w:r>
+    </w:p>
+    <w:p>
+      <w:pPr>
+        <w:pStyle w:val="ListBullet"/>
+        <w:spacing w:after="60"/>
+      </w:pPr>
+      <w:r>
+        <w:rPr>
+          <w:b/>
+          <w:color w:val="16241C"/>
+          <w:sz w:val="21"/>
+        </w:rPr>
+        <w:t>Offer.</w:t>
+      </w:r>
+      <w:r>
+        <w:rPr>
+          <w:b w:val="0"/>
+          <w:color w:val="16241C"/>
+          <w:sz w:val="21"/>
+        </w:rPr>
+        <w:t xml:space="preserve"> First ingredient free, ten-minute setup, cancel any month, backed by a guarantee.</w:t>
+      </w:r>
+    </w:p>
+    <w:p>
+      <w:pPr>
+        <w:pStyle w:val="ListBullet"/>
+        <w:spacing w:after="60"/>
+      </w:pPr>
+      <w:r>
+        <w:rPr>
+          <w:b/>
+          <w:color w:val="16241C"/>
+          <w:sz w:val="21"/>
+        </w:rPr>
+        <w:t>Land and expand.</w:t>
+      </w:r>
+      <w:r>
+        <w:rPr>
+          <w:b w:val="0"/>
+          <w:color w:val="16241C"/>
+          <w:sz w:val="21"/>
+        </w:rPr>
+        <w:t xml:space="preserve"> Start with one ingredient (~$400/month) and grow the account as the agent proves itself, toward the ~$896 blended ARPA.</w:t>
+      </w:r>
+    </w:p>
+    <w:p>
+      <w:pPr>
+        <w:pStyle w:val="ListBullet"/>
+        <w:spacing w:after="60"/>
+      </w:pPr>
+      <w:r>
+        <w:rPr>
+          <w:b/>
+          <w:color w:val="16241C"/>
+          <w:sz w:val="21"/>
+        </w:rPr>
+        <w:t>Expansion trigger.</w:t>
+      </w:r>
+      <w:r>
+        <w:rPr>
+          <w:b w:val="0"/>
+          <w:color w:val="16241C"/>
+          <w:sz w:val="21"/>
+        </w:rPr>
+        <w:t xml:space="preserve"> Once Indianapolis reaches roughly 30–40 kitchens and 15+ farms, open the next metro with the same playbook.</w:t>
+      </w:r>
+    </w:p>
+    <w:p>
+      <w:pPr>
+        <w:jc w:val="both"/>
+      </w:pPr>
+      <w:r>
+        <w:rPr>
+          <w:b w:val="0"/>
+          <w:color w:val="16241C"/>
+          <w:sz w:val="21"/>
+        </w:rPr>
+        <w:t xml:space="preserve">The target segment in the metro is about </w:t>
       </w:r>
       <w:r>
         <w:rPr>
@@ -571,7 +810,7 @@
           <w:color w:val="16241C"/>
           <w:sz w:val="21"/>
         </w:rPr>
-        <w:t>one metro at a time</w:t>
+        <w:t>1,500 independents</w:t>
       </w:r>
       <w:r>
         <w:rPr>
@@ -579,55 +818,7 @@
           <w:color w:val="16241C"/>
           <w:sz w:val="21"/>
         </w:rPr>
-        <w:t xml:space="preserve"> and earn density before expanding. The motion is a </w:t>
-      </w:r>
-      <w:r>
-        <w:rPr>
-          <w:b/>
-          <w:color w:val="16241C"/>
-          <w:sz w:val="21"/>
-        </w:rPr>
-        <w:t>part-time industry insider plus warm introductions</w:t>
-      </w:r>
-      <w:r>
-        <w:rPr>
-          <w:b w:val="0"/>
-          <w:color w:val="16241C"/>
-          <w:sz w:val="21"/>
-        </w:rPr>
-        <w:t xml:space="preserve"> into Indianapolis kitchens — a credibility-led, low-CAC channel rather than cold paid acquisition. The wedge is the </w:t>
-      </w:r>
-      <w:r>
-        <w:rPr>
-          <w:b/>
-          <w:color w:val="16241C"/>
-          <w:sz w:val="21"/>
-        </w:rPr>
-        <w:t>free instant audit</w:t>
-      </w:r>
-      <w:r>
-        <w:rPr>
-          <w:b w:val="0"/>
-          <w:color w:val="16241C"/>
-          <w:sz w:val="21"/>
-        </w:rPr>
-        <w:t xml:space="preserve">: it turns a cold kitchen into a quantified “money on the table” conversation using their own menu, and the free first ingredient removes the risk of trying. We estimate about </w:t>
-      </w:r>
-      <w:r>
-        <w:rPr>
-          <w:b/>
-          <w:color w:val="16241C"/>
-          <w:sz w:val="21"/>
-        </w:rPr>
-        <w:t>1,500 target independents</w:t>
-      </w:r>
-      <w:r>
-        <w:rPr>
-          <w:b w:val="0"/>
-          <w:color w:val="16241C"/>
-          <w:sz w:val="21"/>
-        </w:rPr>
-        <w:t xml:space="preserve"> in the metro.</w:t>
+        <w:t>.</w:t>
       </w:r>
       <w:r>
         <w:rPr>
@@ -661,23 +852,7 @@
           <w:color w:val="16241C"/>
           <w:sz w:val="21"/>
         </w:rPr>
-        <w:t xml:space="preserve">Many have tried this and failed, and the cause of death is consistent. </w:t>
-      </w:r>
-      <w:r>
-        <w:rPr>
-          <w:b/>
-          <w:color w:val="16241C"/>
-          <w:sz w:val="21"/>
-        </w:rPr>
-        <w:t>Webvan</w:t>
-      </w:r>
-      <w:r>
-        <w:rPr>
-          <w:b w:val="0"/>
-          <w:color w:val="16241C"/>
-          <w:sz w:val="21"/>
-        </w:rPr>
-        <w:t xml:space="preserve"> raised more than </w:t>
+        <w:t xml:space="preserve">Many have tried farm-to-table distribution and failed. Webvan raised more than </w:t>
       </w:r>
       <w:r>
         <w:rPr>
@@ -709,23 +884,7 @@
           <w:color w:val="16241C"/>
           <w:sz w:val="21"/>
         </w:rPr>
-        <w:t xml:space="preserve"> </w:t>
-      </w:r>
-      <w:r>
-        <w:rPr>
-          <w:b/>
-          <w:color w:val="16241C"/>
-          <w:sz w:val="21"/>
-        </w:rPr>
-        <w:t>Good Eggs</w:t>
-      </w:r>
-      <w:r>
-        <w:rPr>
-          <w:b w:val="0"/>
-          <w:color w:val="16241C"/>
-          <w:sz w:val="21"/>
-        </w:rPr>
-        <w:t xml:space="preserve"> raised ~$50M, scaled to four cities, and in 2015 retreated to one.</w:t>
+        <w:t xml:space="preserve"> Good Eggs raised ~$50M, scaled to four cities, and in 2015 retreated to one.</w:t>
       </w:r>
       <w:r>
         <w:rPr>
@@ -741,55 +900,7 @@
           <w:color w:val="16241C"/>
           <w:sz w:val="21"/>
         </w:rPr>
-        <w:t xml:space="preserve"> </w:t>
-      </w:r>
-      <w:r>
-        <w:rPr>
-          <w:b/>
-          <w:color w:val="16241C"/>
-          <w:sz w:val="21"/>
-        </w:rPr>
-        <w:t>Farmigo</w:t>
-      </w:r>
-      <w:r>
-        <w:rPr>
-          <w:b w:val="0"/>
-          <w:color w:val="16241C"/>
-          <w:sz w:val="21"/>
-        </w:rPr>
-        <w:t xml:space="preserve">, </w:t>
-      </w:r>
-      <w:r>
-        <w:rPr>
-          <w:b/>
-          <w:color w:val="16241C"/>
-          <w:sz w:val="21"/>
-        </w:rPr>
-        <w:t>Door to Door Organics</w:t>
-      </w:r>
-      <w:r>
-        <w:rPr>
-          <w:b w:val="0"/>
-          <w:color w:val="16241C"/>
-          <w:sz w:val="21"/>
-        </w:rPr>
-        <w:t xml:space="preserve">, and </w:t>
-      </w:r>
-      <w:r>
-        <w:rPr>
-          <w:b/>
-          <w:color w:val="16241C"/>
-          <w:sz w:val="21"/>
-        </w:rPr>
-        <w:t>Relay Foods</w:t>
-      </w:r>
-      <w:r>
-        <w:rPr>
-          <w:b w:val="0"/>
-          <w:color w:val="16241C"/>
-          <w:sz w:val="21"/>
-        </w:rPr>
-        <w:t xml:space="preserve"> each tried to aggregate small farms and deliver, and each shut down by 2016.</w:t>
+        <w:t xml:space="preserve"> Farmigo, Door to Door Organics, and Relay Foods each aggregated small farms and delivered the food themselves, and each closed by 2016.</w:t>
       </w:r>
       <w:r>
         <w:rPr>
@@ -805,23 +916,7 @@
           <w:color w:val="16241C"/>
           <w:sz w:val="21"/>
         </w:rPr>
-        <w:t xml:space="preserve"> They </w:t>
-      </w:r>
-      <w:r>
-        <w:rPr>
-          <w:b/>
-          <w:color w:val="16241C"/>
-          <w:sz w:val="21"/>
-        </w:rPr>
-        <w:t>owned the perishable inventory and the logistics</w:t>
-      </w:r>
-      <w:r>
-        <w:rPr>
-          <w:b w:val="0"/>
-          <w:color w:val="16241C"/>
-          <w:sz w:val="21"/>
-        </w:rPr>
-        <w:t>, sold to price-sensitive consumers, and expanded geography before the unit economics worked. Large distributors (Sysco, US Foods) serve scale but not small local farms; for them, “local” is a checkbox.</w:t>
+        <w:t xml:space="preserve"> In every case the company owned the perishable inventory and the logistics, sold to price-sensitive consumers, and expanded geography before the unit economics worked. Large distributors serve scale rather than small local farms.</w:t>
       </w:r>
     </w:p>
     <w:p>
@@ -834,103 +929,7 @@
           <w:color w:val="16241C"/>
           <w:sz w:val="21"/>
         </w:rPr>
-        <w:t xml:space="preserve">We are different on every count, and the advantage compounds. We own </w:t>
-      </w:r>
-      <w:r>
-        <w:rPr>
-          <w:b/>
-          <w:color w:val="16241C"/>
-          <w:sz w:val="21"/>
-        </w:rPr>
-        <w:t>no warehouses, trucks, or inventory</w:t>
-      </w:r>
-      <w:r>
-        <w:rPr>
-          <w:b w:val="0"/>
-          <w:color w:val="16241C"/>
-          <w:sz w:val="21"/>
-        </w:rPr>
-        <w:t xml:space="preserve">; we sell to </w:t>
-      </w:r>
-      <w:r>
-        <w:rPr>
-          <w:b/>
-          <w:color w:val="16241C"/>
-          <w:sz w:val="21"/>
-        </w:rPr>
-        <w:t>restaurants on a recurring fee</w:t>
-      </w:r>
-      <w:r>
-        <w:rPr>
-          <w:b w:val="0"/>
-          <w:color w:val="16241C"/>
-          <w:sz w:val="21"/>
-        </w:rPr>
-        <w:t xml:space="preserve">; we earn </w:t>
-      </w:r>
-      <w:r>
-        <w:rPr>
-          <w:b/>
-          <w:color w:val="16241C"/>
-          <w:sz w:val="21"/>
-        </w:rPr>
-        <w:t>density in one metro</w:t>
-      </w:r>
-      <w:r>
-        <w:rPr>
-          <w:b w:val="0"/>
-          <w:color w:val="16241C"/>
-          <w:sz w:val="21"/>
-        </w:rPr>
-        <w:t xml:space="preserve"> first; and an </w:t>
-      </w:r>
-      <w:r>
-        <w:rPr>
-          <w:b/>
-          <w:color w:val="16241C"/>
-          <w:sz w:val="21"/>
-        </w:rPr>
-        <w:t>AI agent</w:t>
-      </w:r>
-      <w:r>
-        <w:rPr>
-          <w:b w:val="0"/>
-          <w:color w:val="16241C"/>
-          <w:sz w:val="21"/>
-        </w:rPr>
-        <w:t xml:space="preserve"> runs the coordination that made this unprofitable by hand. That density is the moat: vet a city's farms once and a rival must rebuild the whole local supply base. Every contract, delivery, and price also </w:t>
-      </w:r>
-      <w:r>
-        <w:rPr>
-          <w:b/>
-          <w:color w:val="16241C"/>
-          <w:sz w:val="21"/>
-        </w:rPr>
-        <w:t>trains the agent</w:t>
-      </w:r>
-      <w:r>
-        <w:rPr>
-          <w:b w:val="0"/>
-          <w:color w:val="16241C"/>
-          <w:sz w:val="21"/>
-        </w:rPr>
-        <w:t xml:space="preserve"> on local supply and demand, and once we run a kitchen's sourcing, contracts, and deliveries, </w:t>
-      </w:r>
-      <w:r>
-        <w:rPr>
-          <w:b/>
-          <w:color w:val="16241C"/>
-          <w:sz w:val="21"/>
-        </w:rPr>
-        <w:t>replacing us means rebuilding their supply chain by hand</w:t>
-      </w:r>
-      <w:r>
-        <w:rPr>
-          <w:b w:val="0"/>
-          <w:color w:val="16241C"/>
-          <w:sz w:val="21"/>
-        </w:rPr>
-        <w:t>.</w:t>
+        <w:t>CropConnect owns no warehouses, trucks, or inventory; sells to restaurants on a recurring fee; earns density in one metro before expanding; and runs the coordination with an AI agent. That density is the moat. Vetting a city's farms once forces a rival to rebuild the entire local supply base, every contract and delivery trains the agent on local supply and demand, and a kitchen that runs its sourcing, contracts, and deliveries through us would have to rebuild its supply chain by hand to leave.</w:t>
       </w:r>
     </w:p>
     <w:p>

</xml_diff>

<commit_message>
docs: pre-read v3 — preempt distributor/ops framing, assert real automation, beachhead->metros->farming-platform path, lead with sourcing wedge, ground unit economics, reframe guarantee as CAC tool, add founder-market fit (climate-migration research) + solo-build velocity; remove footer framing line
</commit_message>
<xml_diff>
--- a/pitch/cropconnect-preread.docx
+++ b/pitch/cropconnect-preread.docx
@@ -38,7 +38,7 @@
           <w:color w:val="16241C"/>
           <w:sz w:val="21"/>
         </w:rPr>
-        <w:t xml:space="preserve">CropConnect is an AI agent that runs local sourcing for restaurants end to end: it finds the farms, signs the contracts, runs weekly delivery, holds payment in escrow, and tracks the added margin. The owner names an ingredient and puts the dish on the menu; the agent does the rest. Diners increasingly choose restaurants for local food, while sourcing it by hand remains a second full-time job most independents skip. The product is built and live. We are </w:t>
+        <w:t xml:space="preserve">CropConnect is an AI agent that does one thing for a restaurant: it runs local sourcing end to end — finding the farms, signing the contracts, scheduling weekly delivery, holding payment in escrow, and tracking the added margin. The owner names an ingredient and puts the dish on the menu; the software does the rest, automatically. The business is </w:t>
       </w:r>
       <w:r>
         <w:rPr>
@@ -46,7 +46,7 @@
           <w:color w:val="16241C"/>
           <w:sz w:val="21"/>
         </w:rPr>
-        <w:t>pre-revenue</w:t>
+        <w:t>asset-light</w:t>
       </w:r>
       <w:r>
         <w:rPr>
@@ -54,7 +54,39 @@
           <w:color w:val="16241C"/>
           <w:sz w:val="21"/>
         </w:rPr>
-        <w:t xml:space="preserve">, raising </w:t>
+        <w:t xml:space="preserve">: we own no warehouses, trucks, or inventory, the food is billed at the farm's price, and delivery is third-party, so we earn a </w:t>
+      </w:r>
+      <w:r>
+        <w:rPr>
+          <w:b/>
+          <w:color w:val="16241C"/>
+          <w:sz w:val="21"/>
+        </w:rPr>
+        <w:t>software margin on a monthly service fee</w:t>
+      </w:r>
+      <w:r>
+        <w:rPr>
+          <w:b w:val="0"/>
+          <w:color w:val="16241C"/>
+          <w:sz w:val="21"/>
+        </w:rPr>
+        <w:t xml:space="preserve">, not a distribution margin. The product is </w:t>
+      </w:r>
+      <w:r>
+        <w:rPr>
+          <w:b/>
+          <w:color w:val="16241C"/>
+          <w:sz w:val="21"/>
+        </w:rPr>
+        <w:t>built and live, developed by the founder solo</w:t>
+      </w:r>
+      <w:r>
+        <w:rPr>
+          <w:b w:val="0"/>
+          <w:color w:val="16241C"/>
+          <w:sz w:val="21"/>
+        </w:rPr>
+        <w:t xml:space="preserve">. We are pre-revenue, raising </w:t>
       </w:r>
       <w:r>
         <w:rPr>
@@ -87,6 +119,48 @@
           <w:sz w:val="21"/>
         </w:rPr>
         <w:t>.</w:t>
+      </w:r>
+    </w:p>
+    <w:p>
+      <w:pPr>
+        <w:spacing w:before="220" w:after="60"/>
+      </w:pPr>
+      <w:r>
+        <w:rPr>
+          <w:b/>
+          <w:color w:val="235C3A"/>
+          <w:sz w:val="24"/>
+        </w:rPr>
+        <w:t>The Insight</w:t>
+      </w:r>
+    </w:p>
+    <w:p>
+      <w:pPr>
+        <w:jc w:val="both"/>
+      </w:pPr>
+      <w:r>
+        <w:rPr>
+          <w:b w:val="0"/>
+          <w:color w:val="16241C"/>
+          <w:sz w:val="21"/>
+        </w:rPr>
+        <w:t xml:space="preserve">Until now, running local sourcing for a restaurant required a salaried human coordinator — calling farms, negotiating, scheduling, chasing shortfalls. That made it a money-losing service no software company wanted and no distributor would do for small farms. </w:t>
+      </w:r>
+      <w:r>
+        <w:rPr>
+          <w:b/>
+          <w:color w:val="16241C"/>
+          <w:sz w:val="21"/>
+        </w:rPr>
+        <w:t>AI agents have cut that coordination cost by roughly two orders of magnitude.</w:t>
+      </w:r>
+      <w:r>
+        <w:rPr>
+          <w:b w:val="0"/>
+          <w:color w:val="16241C"/>
+          <w:sz w:val="21"/>
+        </w:rPr>
+        <w:t xml:space="preserve"> That single change turns local sourcing from low-margin logistics into a high-margin software product, and it only became true recently. That is the opportunity.</w:t>
       </w:r>
     </w:p>
     <w:p>
@@ -160,7 +234,7 @@
           <w:color w:val="16241C"/>
           <w:sz w:val="21"/>
         </w:rPr>
-        <w:t xml:space="preserve"> Most growth therefore has to come from charging more for the same seats, and local sourcing is a proven way to do it: </w:t>
+        <w:t xml:space="preserve"> Most growth has to come from charging more for the same seats, and local sourcing is a proven way to do it: </w:t>
       </w:r>
       <w:r>
         <w:rPr>
@@ -256,7 +330,7 @@
           <w:color w:val="16241C"/>
           <w:sz w:val="21"/>
         </w:rPr>
-        <w:t xml:space="preserve"> Sourcing locally by hand means finding farms, vetting them, negotiating, contracting, scheduling, and covering shortfalls, so most independents do not.</w:t>
+        <w:t xml:space="preserve"> Doing it by hand is the blocker, so most independents skip it.</w:t>
       </w:r>
     </w:p>
     <w:p>
@@ -265,11 +339,51 @@
       </w:pPr>
       <w:r>
         <w:rPr>
+          <w:b/>
+          <w:color w:val="16241C"/>
+          <w:sz w:val="21"/>
+        </w:rPr>
+        <w:t>Indianapolis is the beachhead, not the market.</w:t>
+      </w:r>
+      <w:r>
+        <w:rPr>
           <w:b w:val="0"/>
           <w:color w:val="16241C"/>
           <w:sz w:val="21"/>
         </w:rPr>
-        <w:t xml:space="preserve">Durable diner demand for local and AI agents cheap enough to run that coordination as a service have arrived together for the first time. The U.S. restaurant market is large: about </w:t>
+        <w:t xml:space="preserve"> The metro has roughly 4,500 restaurants and about </w:t>
+      </w:r>
+      <w:r>
+        <w:rPr>
+          <w:b/>
+          <w:color w:val="16241C"/>
+          <w:sz w:val="21"/>
+        </w:rPr>
+        <w:t>1,500 target independents</w:t>
+      </w:r>
+      <w:r>
+        <w:rPr>
+          <w:b w:val="0"/>
+          <w:color w:val="16241C"/>
+          <w:sz w:val="21"/>
+        </w:rPr>
+        <w:t>;</w:t>
+      </w:r>
+      <w:r>
+        <w:rPr>
+          <w:color w:val="235C3A"/>
+          <w:sz w:val="14"/>
+          <w:vertAlign w:val="superscript"/>
+        </w:rPr>
+        <w:t>5</w:t>
+      </w:r>
+      <w:r>
+        <w:rPr>
+          <w:b w:val="0"/>
+          <w:color w:val="16241C"/>
+          <w:sz w:val="21"/>
+        </w:rPr>
+        <w:t xml:space="preserve"> the same playbook then repeats city by city, and each metro is a self-contained, already-profitable unit. The U.S. restaurant market is about </w:t>
       </w:r>
       <w:r>
         <w:rPr>
@@ -301,7 +415,7 @@
           <w:color w:val="16241C"/>
           <w:sz w:val="21"/>
         </w:rPr>
-        <w:t xml:space="preserve"> locations in 2024.</w:t>
+        <w:t xml:space="preserve"> locations.</w:t>
       </w:r>
       <w:r>
         <w:rPr>
@@ -310,6 +424,30 @@
           <w:vertAlign w:val="superscript"/>
         </w:rPr>
         <w:t>4</w:t>
+      </w:r>
+      <w:r>
+        <w:rPr>
+          <w:b w:val="0"/>
+          <w:color w:val="16241C"/>
+          <w:sz w:val="21"/>
+        </w:rPr>
+        <w:t xml:space="preserve"> Beyond restaurants, the farm relationships and the allocation layer become a demand aggregator for growers — a </w:t>
+      </w:r>
+      <w:r>
+        <w:rPr>
+          <w:b/>
+          <w:color w:val="16241C"/>
+          <w:sz w:val="21"/>
+        </w:rPr>
+        <w:t>farming platform</w:t>
+      </w:r>
+      <w:r>
+        <w:rPr>
+          <w:b w:val="0"/>
+          <w:color w:val="16241C"/>
+          <w:sz w:val="21"/>
+        </w:rPr>
+        <w:t xml:space="preserve"> that is a larger market than restaurant sourcing alone. We prove one metro first so that expansion is a repeatable motion, not a bet.</w:t>
       </w:r>
     </w:p>
     <w:p>
@@ -335,7 +473,7 @@
           <w:color w:val="16241C"/>
           <w:sz w:val="21"/>
         </w:rPr>
-        <w:t xml:space="preserve">The restaurant enters one need — say, 40 lbs of heirloom tomatoes a week — and the agent, with no further work from the owner: ranks vetted local farms by crop, distance, reliability, and price; splits the order across farms if one cannot cover it; drafts a contract and negotiates quality terms; schedules weekly third-party delivery; holds payment in escrow until delivery is confirmed; and tracks the added margin per dish. Setup takes about </w:t>
+        <w:t xml:space="preserve">The restaurant enters one need — say, 40 lbs of heirloom tomatoes a week — and the agent runs the entire workflow </w:t>
       </w:r>
       <w:r>
         <w:rPr>
@@ -343,7 +481,7 @@
           <w:color w:val="16241C"/>
           <w:sz w:val="21"/>
         </w:rPr>
-        <w:t>ten minutes</w:t>
+        <w:t>automatically</w:t>
       </w:r>
       <w:r>
         <w:rPr>
@@ -351,7 +489,7 @@
           <w:color w:val="16241C"/>
           <w:sz w:val="21"/>
         </w:rPr>
-        <w:t xml:space="preserve"> and the first ingredient is free. The product, including the agent, contracts, escrow, and a free instant sourcing audit, is </w:t>
+        <w:t xml:space="preserve">: it ranks vetted local farms by crop, distance, reliability, and price; splits the order across farms if one cannot cover it; drafts a contract and negotiates quality terms; schedules weekly third-party delivery; holds payment in escrow until delivery is confirmed; and tracks the added margin per dish. </w:t>
       </w:r>
       <w:r>
         <w:rPr>
@@ -359,7 +497,7 @@
           <w:color w:val="16241C"/>
           <w:sz w:val="21"/>
         </w:rPr>
-        <w:t>built and live today</w:t>
+        <w:t>This is real automation, not a manual service dressed as software</w:t>
       </w:r>
       <w:r>
         <w:rPr>
@@ -367,7 +505,28 @@
           <w:color w:val="16241C"/>
           <w:sz w:val="21"/>
         </w:rPr>
-        <w:t>.</w:t>
+        <w:t xml:space="preserve"> — the founder built it as a working product, live today, including a free instant audit any restaurant can run before signing up.</w:t>
+      </w:r>
+    </w:p>
+    <w:p>
+      <w:pPr>
+        <w:jc w:val="both"/>
+      </w:pPr>
+      <w:r>
+        <w:rPr>
+          <w:b/>
+          <w:color w:val="16241C"/>
+          <w:sz w:val="21"/>
+        </w:rPr>
+        <w:t>Sourcing is the wedge.</w:t>
+      </w:r>
+      <w:r>
+        <w:rPr>
+          <w:b w:val="0"/>
+          <w:color w:val="16241C"/>
+          <w:sz w:val="21"/>
+        </w:rPr>
+        <w:t xml:space="preserve"> The same agent and data also power adjacent capabilities — invoice and waste auditing, menu-margin analysis, and menu specials — that deepen retention and grow revenue per account. Sourcing lands the customer; these make it a platform.</w:t>
       </w:r>
     </w:p>
     <w:p>
@@ -393,7 +552,7 @@
           <w:color w:val="16241C"/>
           <w:sz w:val="21"/>
         </w:rPr>
-        <w:t xml:space="preserve">Revenue comes only from a monthly service fee. The food is billed to the restaurant at the farm's price and delivery is contracted to third parties at cost, so both pass through with no markup. The service fee is a </w:t>
+        <w:t xml:space="preserve">Revenue comes only from a monthly service fee. Food is billed at the farm's price and delivery is passed through at third-party cost, both with no markup. The fee is a </w:t>
       </w:r>
       <w:r>
         <w:rPr>
@@ -425,7 +584,7 @@
           <w:color w:val="16241C"/>
           <w:sz w:val="21"/>
         </w:rPr>
-        <w:t xml:space="preserve"> (~$10,700 per year). Our own costs are software, agent compute, and a thin coordination layer.</w:t>
+        <w:t xml:space="preserve"> (~$10,700/year). Because our costs are software, agent compute, and a thin coordination layer, the service-fee gross margin is high.</w:t>
       </w:r>
     </w:p>
     <w:p>
@@ -451,7 +610,7 @@
           <w:color w:val="16241C"/>
           <w:sz w:val="21"/>
         </w:rPr>
-        <w:t>Targets and assumptions below; we are pre-revenue and will replace them with measured numbers from the first cohort.</w:t>
+        <w:t>These are targets, not results; we are pre-revenue and will validate them against the first cohort.</w:t>
       </w:r>
     </w:p>
     <w:p>
@@ -473,7 +632,7 @@
           <w:color w:val="16241C"/>
           <w:sz w:val="21"/>
         </w:rPr>
-        <w:t xml:space="preserve"> ~$896/month (~$10,700/year), starting near $400 on the first ingredient and rising as items are added.</w:t>
+        <w:t xml:space="preserve"> ~$896/month at maturity, starting near $400 on the first ingredient and growing as items are added.</w:t>
       </w:r>
     </w:p>
     <w:p>
@@ -487,7 +646,7 @@
           <w:color w:val="16241C"/>
           <w:sz w:val="21"/>
         </w:rPr>
-        <w:t>Gross margin:</w:t>
+        <w:t>Service-fee gross margin:</w:t>
       </w:r>
       <w:r>
         <w:rPr>
@@ -495,23 +654,7 @@
           <w:color w:val="16241C"/>
           <w:sz w:val="21"/>
         </w:rPr>
-        <w:t xml:space="preserve"> ~80% at scale, or about </w:t>
-      </w:r>
-      <w:r>
-        <w:rPr>
-          <w:b/>
-          <w:color w:val="16241C"/>
-          <w:sz w:val="21"/>
-        </w:rPr>
-        <w:t>$717/month</w:t>
-      </w:r>
-      <w:r>
-        <w:rPr>
-          <w:b w:val="0"/>
-          <w:color w:val="16241C"/>
-          <w:sz w:val="21"/>
-        </w:rPr>
-        <w:t xml:space="preserve"> of gross profit per restaurant.</w:t>
+        <w:t xml:space="preserve"> ~80% target.</w:t>
       </w:r>
     </w:p>
     <w:p>
@@ -533,23 +676,7 @@
           <w:color w:val="16241C"/>
           <w:sz w:val="21"/>
         </w:rPr>
-        <w:t xml:space="preserve"> </w:t>
-      </w:r>
-      <w:r>
-        <w:rPr>
-          <w:b/>
-          <w:color w:val="16241C"/>
-          <w:sz w:val="21"/>
-        </w:rPr>
-        <w:t>$800–$1,200</w:t>
-      </w:r>
-      <w:r>
-        <w:rPr>
-          <w:b w:val="0"/>
-          <w:color w:val="16241C"/>
-          <w:sz w:val="21"/>
-        </w:rPr>
-        <w:t xml:space="preserve"> (insider commission, one onboarding visit, tasting samples).</w:t>
+        <w:t xml:space="preserve"> $800–$1,200 (insider commission, one onboarding visit, samples).</w:t>
       </w:r>
     </w:p>
     <w:p>
@@ -571,23 +698,7 @@
           <w:color w:val="16241C"/>
           <w:sz w:val="21"/>
         </w:rPr>
-        <w:t xml:space="preserve"> about </w:t>
-      </w:r>
-      <w:r>
-        <w:rPr>
-          <w:b/>
-          <w:color w:val="16241C"/>
-          <w:sz w:val="21"/>
-        </w:rPr>
-        <w:t>1–2 months</w:t>
-      </w:r>
-      <w:r>
-        <w:rPr>
-          <w:b w:val="0"/>
-          <w:color w:val="16241C"/>
-          <w:sz w:val="21"/>
-        </w:rPr>
-        <w:t>.</w:t>
+        <w:t xml:space="preserve"> within a few months at target margin.</w:t>
       </w:r>
     </w:p>
     <w:p>
@@ -601,7 +712,7 @@
           <w:color w:val="16241C"/>
           <w:sz w:val="21"/>
         </w:rPr>
-        <w:t>Assumed monthly logo churn:</w:t>
+        <w:t>Monthly logo churn:</w:t>
       </w:r>
       <w:r>
         <w:rPr>
@@ -609,29 +720,20 @@
           <w:color w:val="16241C"/>
           <w:sz w:val="21"/>
         </w:rPr>
-        <w:t xml:space="preserve"> ~3% (roughly a 30-month average customer life), reflecting normal restaurant turnover.</w:t>
+        <w:t xml:space="preserve"> assume ~3%, reflecting normal restaurant turnover; the embedded sourcing, contracts, and deliveries should make real churn lower.</w:t>
       </w:r>
     </w:p>
     <w:p>
       <w:pPr>
-        <w:pStyle w:val="ListBullet"/>
-        <w:spacing w:after="60"/>
+        <w:jc w:val="both"/>
       </w:pPr>
-      <w:r>
-        <w:rPr>
-          <w:b/>
-          <w:color w:val="16241C"/>
-          <w:sz w:val="21"/>
-        </w:rPr>
-        <w:t>Implied LTV (gross profit):</w:t>
-      </w:r>
       <w:r>
         <w:rPr>
           <w:b w:val="0"/>
           <w:color w:val="16241C"/>
           <w:sz w:val="21"/>
         </w:rPr>
-        <w:t xml:space="preserve"> ~$20,000+, for an LTV/CAC well above 10× if these hold.</w:t>
+        <w:t>We treat lifetime value as a hypothesis to test with data, not a number to lead with.</w:t>
       </w:r>
     </w:p>
     <w:p>
@@ -657,7 +759,7 @@
           <w:color w:val="16241C"/>
           <w:sz w:val="21"/>
         </w:rPr>
-        <w:t>We win one metro at a time and earn density before expanding. The Indianapolis plan is specific:</w:t>
+        <w:t>We win one metro at a time and earn density before expanding. The Indianapolis plan:</w:t>
       </w:r>
     </w:p>
     <w:p>
@@ -679,7 +781,7 @@
           <w:color w:val="16241C"/>
           <w:sz w:val="21"/>
         </w:rPr>
-        <w:t xml:space="preserve"> Pre-sign 8–12 vetted local farms across the core crops so fill is guaranteed before we sell a single restaurant. This removes the cold-start problem.</w:t>
+        <w:t xml:space="preserve"> Pre-sign 8–12 vetted farms across the core crops so fill is guaranteed before we sell a restaurant, removing the cold-start problem.</w:t>
       </w:r>
     </w:p>
     <w:p>
@@ -701,7 +803,7 @@
           <w:color w:val="16241C"/>
           <w:sz w:val="21"/>
         </w:rPr>
-        <w:t xml:space="preserve"> A part-time industry insider builds a list of ~150 chef-driven independent restaurants most likely to value local sourcing, drawn from existing relationships.</w:t>
+        <w:t xml:space="preserve"> A part-time industry insider builds a list of ~150 chef-driven independents from existing relationships.</w:t>
       </w:r>
     </w:p>
     <w:p>
@@ -723,7 +825,7 @@
           <w:color w:val="16241C"/>
           <w:sz w:val="21"/>
         </w:rPr>
-        <w:t xml:space="preserve"> Before each conversation we run the free audit on the prospect's public menu and bring a specific, quantified estimate of the margin they are leaving behind.</w:t>
+        <w:t xml:space="preserve"> Before each conversation we run the free audit on the prospect's menu and bring a specific, quantified estimate of the margin they are leaving behind.</w:t>
       </w:r>
     </w:p>
     <w:p>
@@ -737,7 +839,7 @@
           <w:color w:val="16241C"/>
           <w:sz w:val="21"/>
         </w:rPr>
-        <w:t>Offer.</w:t>
+        <w:t>Offer and risk reversal.</w:t>
       </w:r>
       <w:r>
         <w:rPr>
@@ -745,7 +847,23 @@
           <w:color w:val="16241C"/>
           <w:sz w:val="21"/>
         </w:rPr>
-        <w:t xml:space="preserve"> First ingredient free, ten-minute setup, cancel any month, backed by a guarantee.</w:t>
+        <w:t xml:space="preserve"> First ingredient free, ten-minute setup, cancel any month. The guarantee — we find more than we cost or the month is free — is an </w:t>
+      </w:r>
+      <w:r>
+        <w:rPr>
+          <w:b/>
+          <w:color w:val="16241C"/>
+          <w:sz w:val="21"/>
+        </w:rPr>
+        <w:t>acquisition tool</w:t>
+      </w:r>
+      <w:r>
+        <w:rPr>
+          <w:b w:val="0"/>
+          <w:color w:val="16241C"/>
+          <w:sz w:val="21"/>
+        </w:rPr>
+        <w:t xml:space="preserve"> that removes the buyer's risk and shortens the sales cycle; because the savings we find typically exceed the fee, the exposure is small.</w:t>
       </w:r>
     </w:p>
     <w:p>
@@ -767,7 +885,7 @@
           <w:color w:val="16241C"/>
           <w:sz w:val="21"/>
         </w:rPr>
-        <w:t xml:space="preserve"> Start with one ingredient (~$400/month) and grow the account as the agent proves itself, toward the ~$896 blended ARPA.</w:t>
+        <w:t xml:space="preserve"> Start with one ingredient (~$400/month) and grow the account toward the ~$896 blended ARPA.</w:t>
       </w:r>
     </w:p>
     <w:p>
@@ -789,44 +907,7 @@
           <w:color w:val="16241C"/>
           <w:sz w:val="21"/>
         </w:rPr>
-        <w:t xml:space="preserve"> Once Indianapolis reaches roughly 30–40 kitchens and 15+ farms, open the next metro with the same playbook.</w:t>
-      </w:r>
-    </w:p>
-    <w:p>
-      <w:pPr>
-        <w:jc w:val="both"/>
-      </w:pPr>
-      <w:r>
-        <w:rPr>
-          <w:b w:val="0"/>
-          <w:color w:val="16241C"/>
-          <w:sz w:val="21"/>
-        </w:rPr>
-        <w:t xml:space="preserve">The target segment in the metro is about </w:t>
-      </w:r>
-      <w:r>
-        <w:rPr>
-          <w:b/>
-          <w:color w:val="16241C"/>
-          <w:sz w:val="21"/>
-        </w:rPr>
-        <w:t>1,500 independents</w:t>
-      </w:r>
-      <w:r>
-        <w:rPr>
-          <w:b w:val="0"/>
-          <w:color w:val="16241C"/>
-          <w:sz w:val="21"/>
-        </w:rPr>
-        <w:t>.</w:t>
-      </w:r>
-      <w:r>
-        <w:rPr>
-          <w:color w:val="235C3A"/>
-          <w:sz w:val="14"/>
-          <w:vertAlign w:val="superscript"/>
-        </w:rPr>
-        <w:t>5</w:t>
+        <w:t xml:space="preserve"> At roughly 30–40 kitchens and 15+ farms in Indianapolis, open the next metro with the same playbook.</w:t>
       </w:r>
     </w:p>
     <w:p>
@@ -916,7 +997,7 @@
           <w:color w:val="16241C"/>
           <w:sz w:val="21"/>
         </w:rPr>
-        <w:t xml:space="preserve"> In every case the company owned the perishable inventory and the logistics, sold to price-sensitive consumers, and expanded geography before the unit economics worked. Large distributors serve scale rather than small local farms.</w:t>
+        <w:t xml:space="preserve"> In every case the company owned the perishable inventory and the logistics, sold to price-sensitive consumers, and expanded before the unit economics worked. We avoid all three: we own no inventory or logistics, we sell to restaurants on a recurring fee, and we earn density in one metro before expanding.</w:t>
       </w:r>
     </w:p>
     <w:p>
@@ -929,7 +1010,7 @@
           <w:color w:val="16241C"/>
           <w:sz w:val="21"/>
         </w:rPr>
-        <w:t>CropConnect owns no warehouses, trucks, or inventory; sells to restaurants on a recurring fee; earns density in one metro before expanding; and runs the coordination with an AI agent. That density is the moat. Vetting a city's farms once forces a rival to rebuild the entire local supply base, every contract and delivery trains the agent on local supply and demand, and a kitchen that runs its sourcing, contracts, and deliveries through us would have to rebuild its supply chain by hand to leave.</w:t>
+        <w:t>The density becomes the moat. Vetting a city's farms once forces a rival to rebuild the entire local supply base; every contract and delivery trains the agent on local supply and demand; and a kitchen that runs its sourcing, contracts, and deliveries through us would have to rebuild its supply chain by hand to leave.</w:t>
       </w:r>
     </w:p>
     <w:p>
@@ -963,7 +1044,39 @@
           <w:color w:val="16241C"/>
           <w:sz w:val="21"/>
         </w:rPr>
-        <w:t xml:space="preserve">, founder. [Add one or two lines on your relevant background: industry exposure, technical build of the product, and any prior ventures.] Early sales are led by a </w:t>
+        <w:t xml:space="preserve">, founder. His research on the </w:t>
+      </w:r>
+      <w:r>
+        <w:rPr>
+          <w:b/>
+          <w:color w:val="16241C"/>
+          <w:sz w:val="21"/>
+        </w:rPr>
+        <w:t>economic cost of climate-driven migration</w:t>
+      </w:r>
+      <w:r>
+        <w:rPr>
+          <w:b w:val="0"/>
+          <w:color w:val="16241C"/>
+          <w:sz w:val="21"/>
+        </w:rPr>
+        <w:t xml:space="preserve"> gave him a data-level view of how fragile long-distance food supply chains are and why regional, resilient sourcing is where the system is heading — the conviction behind CropConnect. He also </w:t>
+      </w:r>
+      <w:r>
+        <w:rPr>
+          <w:b/>
+          <w:color w:val="16241C"/>
+          <w:sz w:val="21"/>
+        </w:rPr>
+        <w:t>built the entire product solo</w:t>
+      </w:r>
+      <w:r>
+        <w:rPr>
+          <w:b w:val="0"/>
+          <w:color w:val="16241C"/>
+          <w:sz w:val="21"/>
+        </w:rPr>
+        <w:t xml:space="preserve">, from the agent to the contracts and escrow, which is why a working platform already exists at the pre-seed stage. Early sales are led by a </w:t>
       </w:r>
       <w:r>
         <w:rPr>
@@ -992,7 +1105,7 @@
           <w:color w:val="5B6B60"/>
           <w:sz w:val="19"/>
         </w:rPr>
-        <w:t>To complete before sending: founder background, and the insider's name/relationships.</w:t>
+        <w:t>To complete before sending: the insider's name and relationships, and one concrete result or figure from your climate-migration research.</w:t>
       </w:r>
     </w:p>
     <w:p>
@@ -1018,23 +1131,7 @@
           <w:color w:val="16241C"/>
           <w:sz w:val="21"/>
         </w:rPr>
-        <w:t xml:space="preserve">The product is </w:t>
-      </w:r>
-      <w:r>
-        <w:rPr>
-          <w:b/>
-          <w:color w:val="16241C"/>
-          <w:sz w:val="21"/>
-        </w:rPr>
-        <w:t>built and live</w:t>
-      </w:r>
-      <w:r>
-        <w:rPr>
-          <w:b w:val="0"/>
-          <w:color w:val="16241C"/>
-          <w:sz w:val="21"/>
-        </w:rPr>
-        <w:t xml:space="preserve">; we are </w:t>
+        <w:t xml:space="preserve">The product is built and live; we are </w:t>
       </w:r>
       <w:r>
         <w:rPr>
@@ -1165,7 +1262,7 @@
           <w:color w:val="16241C"/>
           <w:sz w:val="21"/>
         </w:rPr>
-        <w:t xml:space="preserve"> Being pre-revenue, we have not yet confirmed a restaurant will pay ~$896/month. Mitigation: the free audit quantifies ROI before they pay, and a guarantee backs it.</w:t>
+        <w:t xml:space="preserve"> Being pre-revenue, we have not yet confirmed a restaurant will pay ~$896/month. Mitigation: the free audit quantifies the return before they pay, and a guarantee backs it.</w:t>
       </w:r>
     </w:p>
     <w:p>
@@ -1275,7 +1372,7 @@
           <w:color w:val="16241C"/>
           <w:sz w:val="21"/>
         </w:rPr>
-        <w:t xml:space="preserve"> A small team is key-person risk. Mitigation: this round funds the first dedicated sales hire.</w:t>
+        <w:t xml:space="preserve"> A solo team is key-person risk. Mitigation: this round funds the first dedicated sales hire.</w:t>
       </w:r>
     </w:p>
     <w:p>
@@ -1289,19 +1386,6 @@
           <w:sz w:val="17"/>
         </w:rPr>
         <w:t>Sources.  1 — Restaurant net-margin and prime-cost benchmarks: National Restaurant Association; Restaurant365 industry benchmarks.  2 — National Restaurant Association, 2022 State of the Restaurant Industry.  3 — FMI, transparency and foodservice trends, 2023.  4 — National Restaurant Association, 2024 industry forecast.  5 — Indianapolis restaurant counts and target-segment figures are internal estimates.  6 — Company outcomes are publicly reported: Webvan (bankruptcy, 2001); Good Eggs (layoffs and market exit, 2015); Farmigo, Door to Door Organics, and Relay Foods (ceased food operations, 2016).</w:t>
-      </w:r>
-    </w:p>
-    <w:p>
-      <w:pPr>
-        <w:spacing w:before="280"/>
-      </w:pPr>
-      <w:r>
-        <w:rPr>
-          <w:b w:val="0"/>
-          <w:color w:val="5B6B60"/>
-          <w:sz w:val="17"/>
-        </w:rPr>
-        <w:t>Keshav Krishnan · keshavkrishnanbusiness@gmail.com · Confidential</w:t>
       </w:r>
     </w:p>
     <w:sectPr>

</xml_diff>

<commit_message>
docs: pre-read edits — rename to The Opportunity with specific AI capabilities; cut story stat + two contrast sentences; add US (~150k/$1.6B) and Indy (~1,500/$16M) plausible-buyer estimates; remove wedge paragraph; itemize CAC (~$850) without 'insider'
</commit_message>
<xml_diff>
--- a/pitch/cropconnect-preread.docx
+++ b/pitch/cropconnect-preread.docx
@@ -131,7 +131,7 @@
           <w:color w:val="235C3A"/>
           <w:sz w:val="24"/>
         </w:rPr>
-        <w:t>The Insight</w:t>
+        <w:t>The Opportunity</w:t>
       </w:r>
     </w:p>
     <w:p>
@@ -144,7 +144,7 @@
           <w:color w:val="16241C"/>
           <w:sz w:val="21"/>
         </w:rPr>
-        <w:t xml:space="preserve">Until now, running local sourcing for a restaurant required a salaried human coordinator — calling farms, negotiating, scheduling, chasing shortfalls. That made it a money-losing service no software company wanted and no distributor would do for small farms. </w:t>
+        <w:t xml:space="preserve">Until now, running local sourcing for a restaurant required a salaried human coordinator. An AI agent can now do that work directly: it </w:t>
       </w:r>
       <w:r>
         <w:rPr>
@@ -152,7 +152,7 @@
           <w:color w:val="16241C"/>
           <w:sz w:val="21"/>
         </w:rPr>
-        <w:t>AI agents have cut that coordination cost by roughly two orders of magnitude.</w:t>
+        <w:t>connects a restaurant to the right local farms, drafts and negotiates custom supply contracts, and runs the ongoing services — delivery tracking, escrow payments, and reconciliation — on its own.</w:t>
       </w:r>
       <w:r>
         <w:rPr>
@@ -160,7 +160,7 @@
           <w:color w:val="16241C"/>
           <w:sz w:val="21"/>
         </w:rPr>
-        <w:t xml:space="preserve"> That single change turns local sourcing from low-margin logistics into a high-margin software product, and it only became true recently. That is the opportunity.</w:t>
+        <w:t xml:space="preserve"> Software can now perform the coordination that used to require a person, which is what makes offering local sourcing profitable. That capability is recent, and it is the opportunity.</w:t>
       </w:r>
     </w:p>
     <w:p>
@@ -266,38 +266,6 @@
           <w:color w:val="16241C"/>
           <w:sz w:val="21"/>
         </w:rPr>
-        <w:t xml:space="preserve"> </w:t>
-      </w:r>
-      <w:r>
-        <w:rPr>
-          <w:b/>
-          <w:color w:val="16241C"/>
-          <w:sz w:val="21"/>
-        </w:rPr>
-        <w:t>55%</w:t>
-      </w:r>
-      <w:r>
-        <w:rPr>
-          <w:b w:val="0"/>
-          <w:color w:val="16241C"/>
-          <w:sz w:val="21"/>
-        </w:rPr>
-        <w:t xml:space="preserve"> want the story behind their food,</w:t>
-      </w:r>
-      <w:r>
-        <w:rPr>
-          <w:color w:val="235C3A"/>
-          <w:sz w:val="14"/>
-          <w:vertAlign w:val="superscript"/>
-        </w:rPr>
-        <w:t>3</w:t>
-      </w:r>
-      <w:r>
-        <w:rPr>
-          <w:b w:val="0"/>
-          <w:color w:val="16241C"/>
-          <w:sz w:val="21"/>
-        </w:rPr>
         <w:t xml:space="preserve"> and the share rating ingredient transparency as important rose from </w:t>
       </w:r>
       <w:r>
@@ -330,7 +298,7 @@
           <w:color w:val="16241C"/>
           <w:sz w:val="21"/>
         </w:rPr>
-        <w:t xml:space="preserve"> Doing it by hand is the blocker, so most independents skip it.</w:t>
+        <w:t xml:space="preserve"> Sourcing locally by hand requires finding farms, vetting them, negotiating, contracting, scheduling, and covering shortfalls.</w:t>
       </w:r>
     </w:p>
     <w:p>
@@ -339,51 +307,11 @@
       </w:pPr>
       <w:r>
         <w:rPr>
-          <w:b/>
-          <w:color w:val="16241C"/>
-          <w:sz w:val="21"/>
-        </w:rPr>
-        <w:t>Indianapolis is the beachhead, not the market.</w:t>
-      </w:r>
-      <w:r>
-        <w:rPr>
           <w:b w:val="0"/>
           <w:color w:val="16241C"/>
           <w:sz w:val="21"/>
         </w:rPr>
-        <w:t xml:space="preserve"> The metro has roughly 4,500 restaurants and about </w:t>
-      </w:r>
-      <w:r>
-        <w:rPr>
-          <w:b/>
-          <w:color w:val="16241C"/>
-          <w:sz w:val="21"/>
-        </w:rPr>
-        <w:t>1,500 target independents</w:t>
-      </w:r>
-      <w:r>
-        <w:rPr>
-          <w:b w:val="0"/>
-          <w:color w:val="16241C"/>
-          <w:sz w:val="21"/>
-        </w:rPr>
-        <w:t>;</w:t>
-      </w:r>
-      <w:r>
-        <w:rPr>
-          <w:color w:val="235C3A"/>
-          <w:sz w:val="14"/>
-          <w:vertAlign w:val="superscript"/>
-        </w:rPr>
-        <w:t>5</w:t>
-      </w:r>
-      <w:r>
-        <w:rPr>
-          <w:b w:val="0"/>
-          <w:color w:val="16241C"/>
-          <w:sz w:val="21"/>
-        </w:rPr>
-        <w:t xml:space="preserve"> the same playbook then repeats city by city, and each metro is a self-contained, already-profitable unit. The U.S. restaurant market is about </w:t>
+        <w:t xml:space="preserve">The U.S. restaurant market is about </w:t>
       </w:r>
       <w:r>
         <w:rPr>
@@ -431,7 +359,119 @@
           <w:color w:val="16241C"/>
           <w:sz w:val="21"/>
         </w:rPr>
-        <w:t xml:space="preserve"> Beyond restaurants, the farm relationships and the allocation layer become a demand aggregator for growers — a </w:t>
+        <w:t xml:space="preserve"> Of those, we estimate about </w:t>
+      </w:r>
+      <w:r>
+        <w:rPr>
+          <w:b/>
+          <w:color w:val="16241C"/>
+          <w:sz w:val="21"/>
+        </w:rPr>
+        <w:t>150,000 are independent full-service restaurants that would plausibly buy</w:t>
+      </w:r>
+      <w:r>
+        <w:rPr>
+          <w:b w:val="0"/>
+          <w:color w:val="16241C"/>
+          <w:sz w:val="21"/>
+        </w:rPr>
+        <w:t xml:space="preserve"> — chef-driven, mid-to-upscale operators that value local sourcing — a serviceable market of roughly </w:t>
+      </w:r>
+      <w:r>
+        <w:rPr>
+          <w:b/>
+          <w:color w:val="16241C"/>
+          <w:sz w:val="21"/>
+        </w:rPr>
+        <w:t>$1.6 billion a year</w:t>
+      </w:r>
+      <w:r>
+        <w:rPr>
+          <w:b w:val="0"/>
+          <w:color w:val="16241C"/>
+          <w:sz w:val="21"/>
+        </w:rPr>
+        <w:t xml:space="preserve"> at our pricing.</w:t>
+      </w:r>
+      <w:r>
+        <w:rPr>
+          <w:color w:val="235C3A"/>
+          <w:sz w:val="14"/>
+          <w:vertAlign w:val="superscript"/>
+        </w:rPr>
+        <w:t>5</w:t>
+      </w:r>
+      <w:r>
+        <w:rPr>
+          <w:b w:val="0"/>
+          <w:color w:val="16241C"/>
+          <w:sz w:val="21"/>
+        </w:rPr>
+        <w:t xml:space="preserve"> In the </w:t>
+      </w:r>
+      <w:r>
+        <w:rPr>
+          <w:b/>
+          <w:color w:val="16241C"/>
+          <w:sz w:val="21"/>
+        </w:rPr>
+        <w:t>Indianapolis</w:t>
+      </w:r>
+      <w:r>
+        <w:rPr>
+          <w:b w:val="0"/>
+          <w:color w:val="16241C"/>
+          <w:sz w:val="21"/>
+        </w:rPr>
+        <w:t xml:space="preserve"> metro, of about 4,500 restaurants we estimate roughly </w:t>
+      </w:r>
+      <w:r>
+        <w:rPr>
+          <w:b/>
+          <w:color w:val="16241C"/>
+          <w:sz w:val="21"/>
+        </w:rPr>
+        <w:t>1,500 fit that profile</w:t>
+      </w:r>
+      <w:r>
+        <w:rPr>
+          <w:b w:val="0"/>
+          <w:color w:val="16241C"/>
+          <w:sz w:val="21"/>
+        </w:rPr>
+        <w:t xml:space="preserve">, about </w:t>
+      </w:r>
+      <w:r>
+        <w:rPr>
+          <w:b/>
+          <w:color w:val="16241C"/>
+          <w:sz w:val="21"/>
+        </w:rPr>
+        <w:t>$16 million a year</w:t>
+      </w:r>
+      <w:r>
+        <w:rPr>
+          <w:b w:val="0"/>
+          <w:color w:val="16241C"/>
+          <w:sz w:val="21"/>
+        </w:rPr>
+        <w:t>.</w:t>
+      </w:r>
+      <w:r>
+        <w:rPr>
+          <w:color w:val="235C3A"/>
+          <w:sz w:val="14"/>
+          <w:vertAlign w:val="superscript"/>
+        </w:rPr>
+        <w:t>5</w:t>
+      </w:r>
+      <w:r>
+        <w:rPr>
+          <w:b w:val="0"/>
+          <w:color w:val="16241C"/>
+          <w:sz w:val="21"/>
+        </w:rPr>
+        <w:t xml:space="preserve"> We start in Indianapolis and repeat the same playbook city by city; each metro is a self-contained, profitable unit. Beyond restaurants, the farm relationships and the allocation layer become a demand aggregator for growers — a </w:t>
       </w:r>
       <w:r>
         <w:rPr>
@@ -447,7 +487,7 @@
           <w:color w:val="16241C"/>
           <w:sz w:val="21"/>
         </w:rPr>
-        <w:t xml:space="preserve"> that is a larger market than restaurant sourcing alone. We prove one metro first so that expansion is a repeatable motion, not a bet.</w:t>
+        <w:t xml:space="preserve"> larger than restaurant sourcing alone.</w:t>
       </w:r>
     </w:p>
     <w:p>
@@ -506,27 +546,6 @@
           <w:sz w:val="21"/>
         </w:rPr>
         <w:t xml:space="preserve"> — the founder built it as a working product, live today, including a free instant audit any restaurant can run before signing up.</w:t>
-      </w:r>
-    </w:p>
-    <w:p>
-      <w:pPr>
-        <w:jc w:val="both"/>
-      </w:pPr>
-      <w:r>
-        <w:rPr>
-          <w:b/>
-          <w:color w:val="16241C"/>
-          <w:sz w:val="21"/>
-        </w:rPr>
-        <w:t>Sourcing is the wedge.</w:t>
-      </w:r>
-      <w:r>
-        <w:rPr>
-          <w:b w:val="0"/>
-          <w:color w:val="16241C"/>
-          <w:sz w:val="21"/>
-        </w:rPr>
-        <w:t xml:space="preserve"> The same agent and data also power adjacent capabilities — invoice and waste auditing, menu-margin analysis, and menu specials — that deepen retention and grow revenue per account. Sourcing lands the customer; these make it a platform.</w:t>
       </w:r>
     </w:p>
     <w:p>
@@ -646,7 +665,7 @@
           <w:color w:val="16241C"/>
           <w:sz w:val="21"/>
         </w:rPr>
-        <w:t>Service-fee gross margin:</w:t>
+        <w:t>Gross margin:</w:t>
       </w:r>
       <w:r>
         <w:rPr>
@@ -654,7 +673,23 @@
           <w:color w:val="16241C"/>
           <w:sz w:val="21"/>
         </w:rPr>
-        <w:t xml:space="preserve"> ~80% target.</w:t>
+        <w:t xml:space="preserve"> ~80%, or about </w:t>
+      </w:r>
+      <w:r>
+        <w:rPr>
+          <w:b/>
+          <w:color w:val="16241C"/>
+          <w:sz w:val="21"/>
+        </w:rPr>
+        <w:t>$717/month</w:t>
+      </w:r>
+      <w:r>
+        <w:rPr>
+          <w:b w:val="0"/>
+          <w:color w:val="16241C"/>
+          <w:sz w:val="21"/>
+        </w:rPr>
+        <w:t xml:space="preserve"> of gross profit per restaurant.</w:t>
       </w:r>
     </w:p>
     <w:p>
@@ -668,7 +703,7 @@
           <w:color w:val="16241C"/>
           <w:sz w:val="21"/>
         </w:rPr>
-        <w:t>CAC target:</w:t>
+        <w:t>CAC: ~$850 per restaurant</w:t>
       </w:r>
       <w:r>
         <w:rPr>
@@ -676,7 +711,7 @@
           <w:color w:val="16241C"/>
           <w:sz w:val="21"/>
         </w:rPr>
-        <w:t xml:space="preserve"> $800–$1,200 (insider commission, one onboarding visit, samples).</w:t>
+        <w:t xml:space="preserve"> — sales commission ~$400, the first ingredient serviced free (~$300 in foregone fee), and onboarding plus tasting samples ~$150.</w:t>
       </w:r>
     </w:p>
     <w:p>
@@ -698,7 +733,23 @@
           <w:color w:val="16241C"/>
           <w:sz w:val="21"/>
         </w:rPr>
-        <w:t xml:space="preserve"> within a few months at target margin.</w:t>
+        <w:t xml:space="preserve"> about </w:t>
+      </w:r>
+      <w:r>
+        <w:rPr>
+          <w:b/>
+          <w:color w:val="16241C"/>
+          <w:sz w:val="21"/>
+        </w:rPr>
+        <w:t>one to two months</w:t>
+      </w:r>
+      <w:r>
+        <w:rPr>
+          <w:b w:val="0"/>
+          <w:color w:val="16241C"/>
+          <w:sz w:val="21"/>
+        </w:rPr>
+        <w:t xml:space="preserve"> at target margin.</w:t>
       </w:r>
     </w:p>
     <w:p>
@@ -712,7 +763,7 @@
           <w:color w:val="16241C"/>
           <w:sz w:val="21"/>
         </w:rPr>
-        <w:t>Monthly logo churn:</w:t>
+        <w:t>Monthly churn:</w:t>
       </w:r>
       <w:r>
         <w:rPr>
@@ -1385,7 +1436,7 @@
           <w:color w:val="5B6B60"/>
           <w:sz w:val="17"/>
         </w:rPr>
-        <w:t>Sources.  1 — Restaurant net-margin and prime-cost benchmarks: National Restaurant Association; Restaurant365 industry benchmarks.  2 — National Restaurant Association, 2022 State of the Restaurant Industry.  3 — FMI, transparency and foodservice trends, 2023.  4 — National Restaurant Association, 2024 industry forecast.  5 — Indianapolis restaurant counts and target-segment figures are internal estimates.  6 — Company outcomes are publicly reported: Webvan (bankruptcy, 2001); Good Eggs (layoffs and market exit, 2015); Farmigo, Door to Door Organics, and Relay Foods (ceased food operations, 2016).</w:t>
+        <w:t>Sources.  1 — Restaurant net-margin and prime-cost benchmarks: National Restaurant Association; Restaurant365 industry benchmarks.  2 — National Restaurant Association, 2022 State of the Restaurant Industry.  3 — FMI, transparency and foodservice trends, 2023.  4 — National Restaurant Association, 2024 industry forecast.  5 — U.S. and Indianapolis target-segment restaurant counts and the revenue estimates derived from them are internal estimates.  6 — Company outcomes are publicly reported: Webvan (bankruptcy, 2001); Good Eggs (layoffs and market exit, 2015); Farmigo, Door to Door Organics, and Relay Foods (ceased food operations, 2016).</w:t>
       </w:r>
     </w:p>
     <w:sectPr>

</xml_diff>

<commit_message>
docs: pre-read — numbered GTM consolidated to farms/restaurants/expand; Why We Win reframed to a few funded players by peak valuation; remove Risks section; remove all em dashes
</commit_message>
<xml_diff>
--- a/pitch/cropconnect-preread.docx
+++ b/pitch/cropconnect-preread.docx
@@ -12,7 +12,7 @@
           <w:color w:val="16241C"/>
           <w:sz w:val="38"/>
         </w:rPr>
-        <w:t>CropConnect — Investor Pre-Read</w:t>
+        <w:t>CropConnect Investor Pre-Read</w:t>
       </w:r>
     </w:p>
     <w:p>
@@ -38,7 +38,7 @@
           <w:color w:val="16241C"/>
           <w:sz w:val="21"/>
         </w:rPr>
-        <w:t xml:space="preserve">CropConnect is an AI agent that does one thing for a restaurant: it runs local sourcing end to end — finding the farms, signing the contracts, scheduling weekly delivery, holding payment in escrow, and tracking the added margin. The owner names an ingredient and puts the dish on the menu; the software does the rest, automatically. The business is </w:t>
+        <w:t xml:space="preserve">CropConnect is an AI agent that does one thing for a restaurant: it runs local sourcing end to end, finding the farms, signing the contracts, scheduling weekly delivery, holding payment in escrow, and tracking the added margin. The owner names an ingredient and puts the dish on the menu; the software does the rest, automatically. The business is </w:t>
       </w:r>
       <w:r>
         <w:rPr>
@@ -152,7 +152,7 @@
           <w:color w:val="16241C"/>
           <w:sz w:val="21"/>
         </w:rPr>
-        <w:t>connects a restaurant to the right local farms, drafts and negotiates custom supply contracts, and runs the ongoing services — delivery tracking, escrow payments, and reconciliation — on its own.</w:t>
+        <w:t>connects a restaurant to the right local farms, drafts and negotiates custom supply contracts, and runs the ongoing services on its own, including delivery tracking, escrow payments, and reconciliation.</w:t>
       </w:r>
       <w:r>
         <w:rPr>
@@ -375,7 +375,7 @@
           <w:color w:val="16241C"/>
           <w:sz w:val="21"/>
         </w:rPr>
-        <w:t xml:space="preserve"> — chef-driven, mid-to-upscale operators that value local sourcing — a serviceable market of roughly </w:t>
+        <w:t xml:space="preserve">: chef-driven, mid-to-upscale operators that value local sourcing. That is a serviceable market of roughly </w:t>
       </w:r>
       <w:r>
         <w:rPr>
@@ -471,7 +471,7 @@
           <w:color w:val="16241C"/>
           <w:sz w:val="21"/>
         </w:rPr>
-        <w:t xml:space="preserve"> We start in Indianapolis and repeat the same playbook city by city; each metro is a self-contained, profitable unit. Beyond restaurants, the farm relationships and the allocation layer become a demand aggregator for growers — a </w:t>
+        <w:t xml:space="preserve"> We start in Indianapolis and repeat the same playbook city by city; each metro is a self-contained, profitable unit. Beyond restaurants, the farm relationships and the allocation layer become a demand aggregator for growers, a </w:t>
       </w:r>
       <w:r>
         <w:rPr>
@@ -513,7 +513,7 @@
           <w:color w:val="16241C"/>
           <w:sz w:val="21"/>
         </w:rPr>
-        <w:t xml:space="preserve">The restaurant enters one need — say, 40 lbs of heirloom tomatoes a week — and the agent runs the entire workflow </w:t>
+        <w:t xml:space="preserve">The restaurant enters one need, say 40 lbs of heirloom tomatoes a week, and the agent runs the entire workflow </w:t>
       </w:r>
       <w:r>
         <w:rPr>
@@ -537,7 +537,7 @@
           <w:color w:val="16241C"/>
           <w:sz w:val="21"/>
         </w:rPr>
-        <w:t>This is real automation, not a manual service dressed as software</w:t>
+        <w:t>This is real automation, not a manual service dressed as software.</w:t>
       </w:r>
       <w:r>
         <w:rPr>
@@ -545,7 +545,7 @@
           <w:color w:val="16241C"/>
           <w:sz w:val="21"/>
         </w:rPr>
-        <w:t xml:space="preserve"> — the founder built it as a working product, live today, including a free instant audit any restaurant can run before signing up.</w:t>
+        <w:t xml:space="preserve"> The founder built it as a working product, live today, including a free instant audit any restaurant can run before signing up.</w:t>
       </w:r>
     </w:p>
     <w:p>
@@ -603,7 +603,7 @@
           <w:color w:val="16241C"/>
           <w:sz w:val="21"/>
         </w:rPr>
-        <w:t xml:space="preserve"> (~$10,700/year). Because our costs are software, agent compute, and a thin coordination layer, the service-fee gross margin is high.</w:t>
+        <w:t xml:space="preserve"> (about $10,700/year). Because our costs are software, agent compute, and a thin coordination layer, the service-fee gross margin is high.</w:t>
       </w:r>
     </w:p>
     <w:p>
@@ -651,7 +651,7 @@
           <w:color w:val="16241C"/>
           <w:sz w:val="21"/>
         </w:rPr>
-        <w:t xml:space="preserve"> ~$896/month at maturity, starting near $400 on the first ingredient and growing as items are added.</w:t>
+        <w:t xml:space="preserve"> about $896/month at maturity, starting near $400 on the first ingredient and growing as items are added.</w:t>
       </w:r>
     </w:p>
     <w:p>
@@ -673,7 +673,7 @@
           <w:color w:val="16241C"/>
           <w:sz w:val="21"/>
         </w:rPr>
-        <w:t xml:space="preserve"> ~80%, or about </w:t>
+        <w:t xml:space="preserve"> about 80%, or roughly </w:t>
       </w:r>
       <w:r>
         <w:rPr>
@@ -703,7 +703,7 @@
           <w:color w:val="16241C"/>
           <w:sz w:val="21"/>
         </w:rPr>
-        <w:t>CAC: ~$850 per restaurant</w:t>
+        <w:t>CAC: about $850 per restaurant.</w:t>
       </w:r>
       <w:r>
         <w:rPr>
@@ -711,7 +711,7 @@
           <w:color w:val="16241C"/>
           <w:sz w:val="21"/>
         </w:rPr>
-        <w:t xml:space="preserve"> — sales commission ~$400, the first ingredient serviced free (~$300 in foregone fee), and onboarding plus tasting samples ~$150.</w:t>
+        <w:t xml:space="preserve"> Sales commission about $400, the first ingredient serviced free (about $300 in foregone fee), and onboarding plus tasting samples about $150.</w:t>
       </w:r>
     </w:p>
     <w:p>
@@ -771,7 +771,7 @@
           <w:color w:val="16241C"/>
           <w:sz w:val="21"/>
         </w:rPr>
-        <w:t xml:space="preserve"> assume ~3%, reflecting normal restaurant turnover; the embedded sourcing, contracts, and deliveries should make real churn lower.</w:t>
+        <w:t xml:space="preserve"> assume about 3%, reflecting normal restaurant turnover; the embedded sourcing, contracts, and deliveries should make real churn lower.</w:t>
       </w:r>
     </w:p>
     <w:p>
@@ -810,13 +810,13 @@
           <w:color w:val="16241C"/>
           <w:sz w:val="21"/>
         </w:rPr>
-        <w:t>We win one metro at a time and earn density before expanding. The Indianapolis plan:</w:t>
+        <w:t>We win one metro at a time and earn density before expanding. The Indianapolis plan has three steps:</w:t>
       </w:r>
     </w:p>
     <w:p>
       <w:pPr>
-        <w:pStyle w:val="ListBullet"/>
-        <w:spacing w:after="60"/>
+        <w:pStyle w:val="ListNumber"/>
+        <w:spacing w:after="80"/>
       </w:pPr>
       <w:r>
         <w:rPr>
@@ -824,7 +824,7 @@
           <w:color w:val="16241C"/>
           <w:sz w:val="21"/>
         </w:rPr>
-        <w:t>Supply first.</w:t>
+        <w:t>Onboard the farms first.</w:t>
       </w:r>
       <w:r>
         <w:rPr>
@@ -832,13 +832,13 @@
           <w:color w:val="16241C"/>
           <w:sz w:val="21"/>
         </w:rPr>
-        <w:t xml:space="preserve"> Pre-sign 8–12 vetted farms across the core crops so fill is guaranteed before we sell a restaurant, removing the cold-start problem.</w:t>
+        <w:t xml:space="preserve"> Pre-sign 8 to 12 vetted local farms across the core crops so supply and fill are guaranteed before we sell a single restaurant. This removes the cold-start problem.</w:t>
       </w:r>
     </w:p>
     <w:p>
       <w:pPr>
-        <w:pStyle w:val="ListBullet"/>
-        <w:spacing w:after="60"/>
+        <w:pStyle w:val="ListNumber"/>
+        <w:spacing w:after="80"/>
       </w:pPr>
       <w:r>
         <w:rPr>
@@ -846,7 +846,7 @@
           <w:color w:val="16241C"/>
           <w:sz w:val="21"/>
         </w:rPr>
-        <w:t>Target list.</w:t>
+        <w:t>Onboard restaurants with the audit.</w:t>
       </w:r>
       <w:r>
         <w:rPr>
@@ -854,13 +854,13 @@
           <w:color w:val="16241C"/>
           <w:sz w:val="21"/>
         </w:rPr>
-        <w:t xml:space="preserve"> A part-time industry insider builds a list of ~150 chef-driven independents from existing relationships.</w:t>
+        <w:t xml:space="preserve"> For each target we run the free audit on their public menu and bring a specific, quantified estimate of the margin they are leaving behind. The offer removes their risk: first ingredient free, ten-minute setup, cancel any month, with a guarantee. We start with one ingredient (about $400/month) and grow the account toward the $896 blended ARPA.</w:t>
       </w:r>
     </w:p>
     <w:p>
       <w:pPr>
-        <w:pStyle w:val="ListBullet"/>
-        <w:spacing w:after="60"/>
+        <w:pStyle w:val="ListNumber"/>
+        <w:spacing w:after="80"/>
       </w:pPr>
       <w:r>
         <w:rPr>
@@ -868,7 +868,7 @@
           <w:color w:val="16241C"/>
           <w:sz w:val="21"/>
         </w:rPr>
-        <w:t>Outreach.</w:t>
+        <w:t>Expand metro by metro.</w:t>
       </w:r>
       <w:r>
         <w:rPr>
@@ -876,89 +876,7 @@
           <w:color w:val="16241C"/>
           <w:sz w:val="21"/>
         </w:rPr>
-        <w:t xml:space="preserve"> Before each conversation we run the free audit on the prospect's menu and bring a specific, quantified estimate of the margin they are leaving behind.</w:t>
-      </w:r>
-    </w:p>
-    <w:p>
-      <w:pPr>
-        <w:pStyle w:val="ListBullet"/>
-        <w:spacing w:after="60"/>
-      </w:pPr>
-      <w:r>
-        <w:rPr>
-          <w:b/>
-          <w:color w:val="16241C"/>
-          <w:sz w:val="21"/>
-        </w:rPr>
-        <w:t>Offer and risk reversal.</w:t>
-      </w:r>
-      <w:r>
-        <w:rPr>
-          <w:b w:val="0"/>
-          <w:color w:val="16241C"/>
-          <w:sz w:val="21"/>
-        </w:rPr>
-        <w:t xml:space="preserve"> First ingredient free, ten-minute setup, cancel any month. The guarantee — we find more than we cost or the month is free — is an </w:t>
-      </w:r>
-      <w:r>
-        <w:rPr>
-          <w:b/>
-          <w:color w:val="16241C"/>
-          <w:sz w:val="21"/>
-        </w:rPr>
-        <w:t>acquisition tool</w:t>
-      </w:r>
-      <w:r>
-        <w:rPr>
-          <w:b w:val="0"/>
-          <w:color w:val="16241C"/>
-          <w:sz w:val="21"/>
-        </w:rPr>
-        <w:t xml:space="preserve"> that removes the buyer's risk and shortens the sales cycle; because the savings we find typically exceed the fee, the exposure is small.</w:t>
-      </w:r>
-    </w:p>
-    <w:p>
-      <w:pPr>
-        <w:pStyle w:val="ListBullet"/>
-        <w:spacing w:after="60"/>
-      </w:pPr>
-      <w:r>
-        <w:rPr>
-          <w:b/>
-          <w:color w:val="16241C"/>
-          <w:sz w:val="21"/>
-        </w:rPr>
-        <w:t>Land and expand.</w:t>
-      </w:r>
-      <w:r>
-        <w:rPr>
-          <w:b w:val="0"/>
-          <w:color w:val="16241C"/>
-          <w:sz w:val="21"/>
-        </w:rPr>
-        <w:t xml:space="preserve"> Start with one ingredient (~$400/month) and grow the account toward the ~$896 blended ARPA.</w:t>
-      </w:r>
-    </w:p>
-    <w:p>
-      <w:pPr>
-        <w:pStyle w:val="ListBullet"/>
-        <w:spacing w:after="60"/>
-      </w:pPr>
-      <w:r>
-        <w:rPr>
-          <w:b/>
-          <w:color w:val="16241C"/>
-          <w:sz w:val="21"/>
-        </w:rPr>
-        <w:t>Expansion trigger.</w:t>
-      </w:r>
-      <w:r>
-        <w:rPr>
-          <w:b w:val="0"/>
-          <w:color w:val="16241C"/>
-          <w:sz w:val="21"/>
-        </w:rPr>
-        <w:t xml:space="preserve"> At roughly 30–40 kitchens and 15+ farms in Indianapolis, open the next metro with the same playbook.</w:t>
+        <w:t xml:space="preserve"> At roughly 30 to 40 kitchens and 15 or more farms in Indianapolis, open the next city with the same playbook.</w:t>
       </w:r>
     </w:p>
     <w:p>
@@ -984,7 +902,7 @@
           <w:color w:val="16241C"/>
           <w:sz w:val="21"/>
         </w:rPr>
-        <w:t xml:space="preserve">Many have tried farm-to-table distribution and failed. Webvan raised more than </w:t>
+        <w:t xml:space="preserve">Investors have put real money into food-supply software, which shows the demand is real. Misfits Market reached about a </w:t>
       </w:r>
       <w:r>
         <w:rPr>
@@ -992,7 +910,7 @@
           <w:color w:val="16241C"/>
           <w:sz w:val="21"/>
         </w:rPr>
-        <w:t>$800M</w:t>
+        <w:t>$2B</w:t>
       </w:r>
       <w:r>
         <w:rPr>
@@ -1000,7 +918,39 @@
           <w:color w:val="16241C"/>
           <w:sz w:val="21"/>
         </w:rPr>
-        <w:t>, built its own warehouses and trucks, expanded city by city, and went bankrupt in 2001.</w:t>
+        <w:t xml:space="preserve"> valuation, Choco about </w:t>
+      </w:r>
+      <w:r>
+        <w:rPr>
+          <w:b/>
+          <w:color w:val="16241C"/>
+          <w:sz w:val="21"/>
+        </w:rPr>
+        <w:t>$1.2B</w:t>
+      </w:r>
+      <w:r>
+        <w:rPr>
+          <w:b w:val="0"/>
+          <w:color w:val="16241C"/>
+          <w:sz w:val="21"/>
+        </w:rPr>
+        <w:t xml:space="preserve">, and Afresh has raised about </w:t>
+      </w:r>
+      <w:r>
+        <w:rPr>
+          <w:b/>
+          <w:color w:val="16241C"/>
+          <w:sz w:val="21"/>
+        </w:rPr>
+        <w:t>$148M</w:t>
+      </w:r>
+      <w:r>
+        <w:rPr>
+          <w:b w:val="0"/>
+          <w:color w:val="16241C"/>
+          <w:sz w:val="21"/>
+        </w:rPr>
+        <w:t xml:space="preserve"> for grocery forecasting.</w:t>
       </w:r>
       <w:r>
         <w:rPr>
@@ -1016,39 +966,7 @@
           <w:color w:val="16241C"/>
           <w:sz w:val="21"/>
         </w:rPr>
-        <w:t xml:space="preserve"> Good Eggs raised ~$50M, scaled to four cities, and in 2015 retreated to one.</w:t>
-      </w:r>
-      <w:r>
-        <w:rPr>
-          <w:color w:val="235C3A"/>
-          <w:sz w:val="14"/>
-          <w:vertAlign w:val="superscript"/>
-        </w:rPr>
-        <w:t>6</w:t>
-      </w:r>
-      <w:r>
-        <w:rPr>
-          <w:b w:val="0"/>
-          <w:color w:val="16241C"/>
-          <w:sz w:val="21"/>
-        </w:rPr>
-        <w:t xml:space="preserve"> Farmigo, Door to Door Organics, and Relay Foods each aggregated small farms and delivered the food themselves, and each closed by 2016.</w:t>
-      </w:r>
-      <w:r>
-        <w:rPr>
-          <w:color w:val="235C3A"/>
-          <w:sz w:val="14"/>
-          <w:vertAlign w:val="superscript"/>
-        </w:rPr>
-        <w:t>6</w:t>
-      </w:r>
-      <w:r>
-        <w:rPr>
-          <w:b w:val="0"/>
-          <w:color w:val="16241C"/>
-          <w:sz w:val="21"/>
-        </w:rPr>
-        <w:t xml:space="preserve"> In every case the company owned the perishable inventory and the logistics, sold to price-sensitive consumers, and expanded before the unit economics worked. We avoid all three: we own no inventory or logistics, we sell to restaurants on a recurring fee, and we earn density in one metro before expanding.</w:t>
+        <w:t xml:space="preserve"> None of them does what we do. Choco digitizes ordering between a restaurant and the distributors it already uses, but it does not find or contract local farms. Afresh forecasts inventory for grocery chains. Misfits Market sells surplus produce to consumers. CropConnect is the only one that runs local sourcing end to end for restaurants: finding the farms, contracting them, and managing delivery, escrow, and margin.</w:t>
       </w:r>
     </w:p>
     <w:p>
@@ -1061,7 +979,7 @@
           <w:color w:val="16241C"/>
           <w:sz w:val="21"/>
         </w:rPr>
-        <w:t>The density becomes the moat. Vetting a city's farms once forces a rival to rebuild the entire local supply base; every contract and delivery trains the agent on local supply and demand; and a kitchen that runs its sourcing, contracts, and deliveries through us would have to rebuild its supply chain by hand to leave.</w:t>
+        <w:t>The companies that tried to deliver local food themselves struggled because they owned the perishable inventory and the logistics. We stay asset-light and pass the food through at cost, which is why the economics work for us. The advantage also compounds: vetting a city's farms once forces a rival to rebuild the entire local supply base, every contract and delivery trains the agent on local supply and demand, and a kitchen that runs its sourcing, contracts, and deliveries through us would have to rebuild its supply chain by hand to leave.</w:t>
       </w:r>
     </w:p>
     <w:p>
@@ -1111,7 +1029,7 @@
           <w:color w:val="16241C"/>
           <w:sz w:val="21"/>
         </w:rPr>
-        <w:t xml:space="preserve"> gave him a data-level view of how fragile long-distance food supply chains are and why regional, resilient sourcing is where the system is heading — the conviction behind CropConnect. He also </w:t>
+        <w:t xml:space="preserve"> gave him a data-level view of how fragile long-distance food supply chains are and why regional, resilient sourcing is where the system is heading, the conviction behind CropConnect. He also </w:t>
       </w:r>
       <w:r>
         <w:rPr>
@@ -1156,7 +1074,7 @@
           <w:color w:val="5B6B60"/>
           <w:sz w:val="19"/>
         </w:rPr>
-        <w:t>To complete before sending: the insider's name and relationships, and one concrete result or figure from your climate-migration research.</w:t>
+        <w:t>To complete before sending: the insider's name and relationships, and one concrete figure from your climate-migration research.</w:t>
       </w:r>
     </w:p>
     <w:p>
@@ -1270,7 +1188,7 @@
           <w:color w:val="16241C"/>
           <w:sz w:val="21"/>
         </w:rPr>
-        <w:t>15 paying kitchens and ~$13,000 in monthly recurring revenue in Indianapolis within 90 days</w:t>
+        <w:t>15 paying kitchens and about $13,000 in monthly recurring revenue in Indianapolis within 90 days</w:t>
       </w:r>
       <w:r>
         <w:rPr>
@@ -1278,152 +1196,7 @@
           <w:color w:val="16241C"/>
           <w:sz w:val="21"/>
         </w:rPr>
-        <w:t xml:space="preserve"> — the proof point to raise a priced seed.</w:t>
-      </w:r>
-    </w:p>
-    <w:p>
-      <w:pPr>
-        <w:spacing w:before="220" w:after="60"/>
-      </w:pPr>
-      <w:r>
-        <w:rPr>
-          <w:b/>
-          <w:color w:val="235C3A"/>
-          <w:sz w:val="24"/>
-        </w:rPr>
-        <w:t>Risks and Open Questions</w:t>
-      </w:r>
-    </w:p>
-    <w:p>
-      <w:pPr>
-        <w:pStyle w:val="ListBullet"/>
-        <w:spacing w:after="60"/>
-      </w:pPr>
-      <w:r>
-        <w:rPr>
-          <w:b/>
-          <w:color w:val="16241C"/>
-          <w:sz w:val="21"/>
-        </w:rPr>
-        <w:t>Willingness to pay is unproven.</w:t>
-      </w:r>
-      <w:r>
-        <w:rPr>
-          <w:b w:val="0"/>
-          <w:color w:val="16241C"/>
-          <w:sz w:val="21"/>
-        </w:rPr>
-        <w:t xml:space="preserve"> Being pre-revenue, we have not yet confirmed a restaurant will pay ~$896/month. Mitigation: the free audit quantifies the return before they pay, and a guarantee backs it.</w:t>
-      </w:r>
-    </w:p>
-    <w:p>
-      <w:pPr>
-        <w:pStyle w:val="ListBullet"/>
-        <w:spacing w:after="60"/>
-      </w:pPr>
-      <w:r>
-        <w:rPr>
-          <w:b/>
-          <w:color w:val="16241C"/>
-          <w:sz w:val="21"/>
-        </w:rPr>
-        <w:t>Acquisition is unproven.</w:t>
-      </w:r>
-      <w:r>
-        <w:rPr>
-          <w:b w:val="0"/>
-          <w:color w:val="16241C"/>
-          <w:sz w:val="21"/>
-        </w:rPr>
-        <w:t xml:space="preserve"> Restaurants are slow, low-tech buyers; the insider/warm-intro motion may not scale cheaply. Mitigation: start where introductions exist and measure CAC and sales-cycle from the first cohort.</w:t>
-      </w:r>
-    </w:p>
-    <w:p>
-      <w:pPr>
-        <w:pStyle w:val="ListBullet"/>
-        <w:spacing w:after="60"/>
-      </w:pPr>
-      <w:r>
-        <w:rPr>
-          <w:b/>
-          <w:color w:val="16241C"/>
-          <w:sz w:val="21"/>
-        </w:rPr>
-        <w:t>Operational reliability.</w:t>
-      </w:r>
-      <w:r>
-        <w:rPr>
-          <w:b w:val="0"/>
-          <w:color w:val="16241C"/>
-          <w:sz w:val="21"/>
-        </w:rPr>
-        <w:t xml:space="preserve"> A single missed delivery breaks trust, and coordinating perishable weekly supply is hard even asset-light. Mitigation: a backup farm stands by for every crop; escrow aligns the farm's incentive to deliver.</w:t>
-      </w:r>
-    </w:p>
-    <w:p>
-      <w:pPr>
-        <w:pStyle w:val="ListBullet"/>
-        <w:spacing w:after="60"/>
-      </w:pPr>
-      <w:r>
-        <w:rPr>
-          <w:b/>
-          <w:color w:val="16241C"/>
-          <w:sz w:val="21"/>
-        </w:rPr>
-        <w:t>Churn.</w:t>
-      </w:r>
-      <w:r>
-        <w:rPr>
-          <w:b w:val="0"/>
-          <w:color w:val="16241C"/>
-          <w:sz w:val="21"/>
-        </w:rPr>
-        <w:t xml:space="preserve"> Independent restaurants close often and run thin. Mitigation: deep switching costs once we are embedded in their sourcing and contracts.</w:t>
-      </w:r>
-    </w:p>
-    <w:p>
-      <w:pPr>
-        <w:pStyle w:val="ListBullet"/>
-        <w:spacing w:after="60"/>
-      </w:pPr>
-      <w:r>
-        <w:rPr>
-          <w:b/>
-          <w:color w:val="16241C"/>
-          <w:sz w:val="21"/>
-        </w:rPr>
-        <w:t>Cold start / density.</w:t>
-      </w:r>
-      <w:r>
-        <w:rPr>
-          <w:b w:val="0"/>
-          <w:color w:val="16241C"/>
-          <w:sz w:val="21"/>
-        </w:rPr>
-        <w:t xml:space="preserve"> The flywheel needs both farms and restaurants in a metro. Mitigation: seed the farm side first and stay in one metro until it is dense.</w:t>
-      </w:r>
-    </w:p>
-    <w:p>
-      <w:pPr>
-        <w:pStyle w:val="ListBullet"/>
-        <w:spacing w:after="60"/>
-      </w:pPr>
-      <w:r>
-        <w:rPr>
-          <w:b/>
-          <w:color w:val="16241C"/>
-          <w:sz w:val="21"/>
-        </w:rPr>
-        <w:t>Team depth.</w:t>
-      </w:r>
-      <w:r>
-        <w:rPr>
-          <w:b w:val="0"/>
-          <w:color w:val="16241C"/>
-          <w:sz w:val="21"/>
-        </w:rPr>
-        <w:t xml:space="preserve"> A solo team is key-person risk. Mitigation: this round funds the first dedicated sales hire.</w:t>
+        <w:t>, the proof point to raise a priced seed.</w:t>
       </w:r>
     </w:p>
     <w:p>
@@ -1436,7 +1209,7 @@
           <w:color w:val="5B6B60"/>
           <w:sz w:val="17"/>
         </w:rPr>
-        <w:t>Sources.  1 — Restaurant net-margin and prime-cost benchmarks: National Restaurant Association; Restaurant365 industry benchmarks.  2 — National Restaurant Association, 2022 State of the Restaurant Industry.  3 — FMI, transparency and foodservice trends, 2023.  4 — National Restaurant Association, 2024 industry forecast.  5 — U.S. and Indianapolis target-segment restaurant counts and the revenue estimates derived from them are internal estimates.  6 — Company outcomes are publicly reported: Webvan (bankruptcy, 2001); Good Eggs (layoffs and market exit, 2015); Farmigo, Door to Door Organics, and Relay Foods (ceased food operations, 2016).</w:t>
+        <w:t>Sources.  1. Restaurant net-margin and prime-cost benchmarks: National Restaurant Association; Restaurant365 industry benchmarks.  2. National Restaurant Association, 2022 State of the Restaurant Industry.  3. FMI, transparency and foodservice trends, 2023.  4. National Restaurant Association, 2024 industry forecast.  5. U.S. and Indianapolis target-segment restaurant counts and the revenue estimates derived from them are internal estimates.  6. Valuations are peak reported figures from press and PitchBook: Misfits Market (about $2B, 2021) and Choco (about $1.2B, 2022); Afresh has raised about $148M.</w:t>
       </w:r>
     </w:p>
     <w:sectPr>

</xml_diff>

<commit_message>
docs: pre-read — replace remaining en dashes in ranges with 'to'
</commit_message>
<xml_diff>
--- a/pitch/cropconnect-preread.docx
+++ b/pitch/cropconnect-preread.docx
@@ -94,7 +94,7 @@
           <w:color w:val="16241C"/>
           <w:sz w:val="21"/>
         </w:rPr>
-        <w:t>$50,000–$100,000</w:t>
+        <w:t>$50,000 to $100,000</w:t>
       </w:r>
       <w:r>
         <w:rPr>
@@ -194,7 +194,7 @@
           <w:color w:val="16241C"/>
           <w:sz w:val="21"/>
         </w:rPr>
-        <w:t>3–5% of revenue</w:t>
+        <w:t>3% to 5% of revenue</w:t>
       </w:r>
       <w:r>
         <w:rPr>
@@ -1124,7 +1124,7 @@
           <w:color w:val="16241C"/>
           <w:sz w:val="21"/>
         </w:rPr>
-        <w:t>$50,000–$100,000</w:t>
+        <w:t>$50,000 to $100,000</w:t>
       </w:r>
       <w:r>
         <w:rPr>

</xml_diff>

<commit_message>
docs: pre-read — remove rhetorical contrasts (manual service dressed as software; not a distribution margin; none does what we do), keep professional phrasing
</commit_message>
<xml_diff>
--- a/pitch/cropconnect-preread.docx
+++ b/pitch/cropconnect-preread.docx
@@ -54,7 +54,7 @@
           <w:color w:val="16241C"/>
           <w:sz w:val="21"/>
         </w:rPr>
-        <w:t xml:space="preserve">: we own no warehouses, trucks, or inventory, the food is billed at the farm's price, and delivery is third-party, so we earn a </w:t>
+        <w:t xml:space="preserve">: we own no warehouses, trucks, or inventory, the food is billed at the farm's price, and delivery is third-party, so our only revenue is a </w:t>
       </w:r>
       <w:r>
         <w:rPr>
@@ -62,7 +62,7 @@
           <w:color w:val="16241C"/>
           <w:sz w:val="21"/>
         </w:rPr>
-        <w:t>software margin on a monthly service fee</w:t>
+        <w:t>monthly service fee</w:t>
       </w:r>
       <w:r>
         <w:rPr>
@@ -70,7 +70,7 @@
           <w:color w:val="16241C"/>
           <w:sz w:val="21"/>
         </w:rPr>
-        <w:t xml:space="preserve">, not a distribution margin. The product is </w:t>
+        <w:t xml:space="preserve"> with software-level margins. The product is </w:t>
       </w:r>
       <w:r>
         <w:rPr>
@@ -529,23 +529,7 @@
           <w:color w:val="16241C"/>
           <w:sz w:val="21"/>
         </w:rPr>
-        <w:t xml:space="preserve">: it ranks vetted local farms by crop, distance, reliability, and price; splits the order across farms if one cannot cover it; drafts a contract and negotiates quality terms; schedules weekly third-party delivery; holds payment in escrow until delivery is confirmed; and tracks the added margin per dish. </w:t>
-      </w:r>
-      <w:r>
-        <w:rPr>
-          <w:b/>
-          <w:color w:val="16241C"/>
-          <w:sz w:val="21"/>
-        </w:rPr>
-        <w:t>This is real automation, not a manual service dressed as software.</w:t>
-      </w:r>
-      <w:r>
-        <w:rPr>
-          <w:b w:val="0"/>
-          <w:color w:val="16241C"/>
-          <w:sz w:val="21"/>
-        </w:rPr>
-        <w:t xml:space="preserve"> The founder built it as a working product, live today, including a free instant audit any restaurant can run before signing up.</w:t>
+        <w:t>: it ranks vetted local farms by crop, distance, reliability, and price; splits the order across farms if one cannot cover it; drafts a contract and negotiates quality terms; schedules weekly third-party delivery; holds payment in escrow until delivery is confirmed; and tracks the added margin per dish. The founder built it as a working product, live today; each step runs in software without manual intervention. A restaurant can run a free instant audit before signing up.</w:t>
       </w:r>
     </w:p>
     <w:p>
@@ -966,7 +950,7 @@
           <w:color w:val="16241C"/>
           <w:sz w:val="21"/>
         </w:rPr>
-        <w:t xml:space="preserve"> None of them does what we do. Choco digitizes ordering between a restaurant and the distributors it already uses, but it does not find or contract local farms. Afresh forecasts inventory for grocery chains. Misfits Market sells surplus produce to consumers. CropConnect is the only one that runs local sourcing end to end for restaurants: finding the farms, contracting them, and managing delivery, escrow, and margin.</w:t>
+        <w:t xml:space="preserve"> None offers done-for-you local sourcing for restaurants. Choco digitizes ordering between a restaurant and the distributors it already uses, but it does not find or contract local farms. Afresh forecasts inventory for grocery chains. Misfits Market sells surplus produce to consumers. CropConnect is the only one that runs local sourcing end to end for restaurants: finding the farms, contracting them, and managing delivery, escrow, and margin.</w:t>
       </w:r>
     </w:p>
     <w:p>

</xml_diff>

<commit_message>
docs: pre-read unit economics — itemized cost-to-serve with named APIs (Anthropic Claude, Stripe Connect, Supabase/Vercel, courier API); CAC = commission + one week token/delivery cost; remove 'insider'
</commit_message>
<xml_diff>
--- a/pitch/cropconnect-preread.docx
+++ b/pitch/cropconnect-preread.docx
@@ -649,7 +649,7 @@
           <w:color w:val="16241C"/>
           <w:sz w:val="21"/>
         </w:rPr>
-        <w:t>Gross margin:</w:t>
+        <w:t>Cost to serve one restaurant: about $130/month</w:t>
       </w:r>
       <w:r>
         <w:rPr>
@@ -657,7 +657,7 @@
           <w:color w:val="16241C"/>
           <w:sz w:val="21"/>
         </w:rPr>
-        <w:t xml:space="preserve"> about 80%, or roughly </w:t>
+        <w:t xml:space="preserve">, for a gross margin near </w:t>
       </w:r>
       <w:r>
         <w:rPr>
@@ -665,7 +665,7 @@
           <w:color w:val="16241C"/>
           <w:sz w:val="21"/>
         </w:rPr>
-        <w:t>$717/month</w:t>
+        <w:t>85%</w:t>
       </w:r>
       <w:r>
         <w:rPr>
@@ -673,7 +673,146 @@
           <w:color w:val="16241C"/>
           <w:sz w:val="21"/>
         </w:rPr>
-        <w:t xml:space="preserve"> of gross profit per restaurant.</w:t>
+        <w:t xml:space="preserve"> (about $766/month of gross profit). The components:</w:t>
+      </w:r>
+    </w:p>
+    <w:p>
+      <w:pPr>
+        <w:pStyle w:val="ListBullet"/>
+        <w:spacing w:after="40"/>
+        <w:ind w:left="936"/>
+      </w:pPr>
+      <w:r>
+        <w:rPr>
+          <w:b w:val="0"/>
+          <w:color w:val="16241C"/>
+          <w:sz w:val="20"/>
+        </w:rPr>
+        <w:t xml:space="preserve">Agent tokens on the </w:t>
+      </w:r>
+      <w:r>
+        <w:rPr>
+          <w:b/>
+          <w:color w:val="16241C"/>
+          <w:sz w:val="20"/>
+        </w:rPr>
+        <w:t>Anthropic Claude API</w:t>
+      </w:r>
+      <w:r>
+        <w:rPr>
+          <w:b w:val="0"/>
+          <w:color w:val="16241C"/>
+          <w:sz w:val="20"/>
+        </w:rPr>
+        <w:t>, about $45 (farm matching, drafting and negotiating contracts, monthly audits, and specials).</w:t>
+      </w:r>
+    </w:p>
+    <w:p>
+      <w:pPr>
+        <w:pStyle w:val="ListBullet"/>
+        <w:spacing w:after="40"/>
+        <w:ind w:left="936"/>
+      </w:pPr>
+      <w:r>
+        <w:rPr>
+          <w:b w:val="0"/>
+          <w:color w:val="16241C"/>
+          <w:sz w:val="20"/>
+        </w:rPr>
+        <w:t xml:space="preserve">Payments and escrow on </w:t>
+      </w:r>
+      <w:r>
+        <w:rPr>
+          <w:b/>
+          <w:color w:val="16241C"/>
+          <w:sz w:val="20"/>
+        </w:rPr>
+        <w:t>Stripe Connect</w:t>
+      </w:r>
+      <w:r>
+        <w:rPr>
+          <w:b w:val="0"/>
+          <w:color w:val="16241C"/>
+          <w:sz w:val="20"/>
+        </w:rPr>
+        <w:t>, about $50 (card processing on the service fee; food held in escrow moves over ACH to keep fees low).</w:t>
+      </w:r>
+    </w:p>
+    <w:p>
+      <w:pPr>
+        <w:pStyle w:val="ListBullet"/>
+        <w:spacing w:after="40"/>
+        <w:ind w:left="936"/>
+      </w:pPr>
+      <w:r>
+        <w:rPr>
+          <w:b w:val="0"/>
+          <w:color w:val="16241C"/>
+          <w:sz w:val="20"/>
+        </w:rPr>
+        <w:t xml:space="preserve">Database, auth, and hosting on </w:t>
+      </w:r>
+      <w:r>
+        <w:rPr>
+          <w:b/>
+          <w:color w:val="16241C"/>
+          <w:sz w:val="20"/>
+        </w:rPr>
+        <w:t>Supabase and Vercel</w:t>
+      </w:r>
+      <w:r>
+        <w:rPr>
+          <w:b w:val="0"/>
+          <w:color w:val="16241C"/>
+          <w:sz w:val="20"/>
+        </w:rPr>
+        <w:t>, about $15.</w:t>
+      </w:r>
+    </w:p>
+    <w:p>
+      <w:pPr>
+        <w:pStyle w:val="ListBullet"/>
+        <w:spacing w:after="40"/>
+        <w:ind w:left="936"/>
+      </w:pPr>
+      <w:r>
+        <w:rPr>
+          <w:b w:val="0"/>
+          <w:color w:val="16241C"/>
+          <w:sz w:val="20"/>
+        </w:rPr>
+        <w:t>Light human oversight, about $20.</w:t>
+      </w:r>
+    </w:p>
+    <w:p>
+      <w:pPr>
+        <w:pStyle w:val="ListBullet"/>
+        <w:spacing w:after="40"/>
+        <w:ind w:left="936"/>
+      </w:pPr>
+      <w:r>
+        <w:rPr>
+          <w:b w:val="0"/>
+          <w:color w:val="16241C"/>
+          <w:sz w:val="20"/>
+        </w:rPr>
+        <w:t xml:space="preserve">Delivery runs through a </w:t>
+      </w:r>
+      <w:r>
+        <w:rPr>
+          <w:b/>
+          <w:color w:val="16241C"/>
+          <w:sz w:val="20"/>
+        </w:rPr>
+        <w:t>third-party courier API (for example Uber Direct)</w:t>
+      </w:r>
+      <w:r>
+        <w:rPr>
+          <w:b w:val="0"/>
+          <w:color w:val="16241C"/>
+          <w:sz w:val="20"/>
+        </w:rPr>
+        <w:t xml:space="preserve"> and is billed through to the restaurant at cost, so it is not a margin cost to us.</w:t>
       </w:r>
     </w:p>
     <w:p>
@@ -687,7 +826,7 @@
           <w:color w:val="16241C"/>
           <w:sz w:val="21"/>
         </w:rPr>
-        <w:t>CAC: about $850 per restaurant.</w:t>
+        <w:t>CAC: about $450 per restaurant</w:t>
       </w:r>
       <w:r>
         <w:rPr>
@@ -695,7 +834,7 @@
           <w:color w:val="16241C"/>
           <w:sz w:val="21"/>
         </w:rPr>
-        <w:t xml:space="preserve"> Sales commission about $400, the first ingredient serviced free (about $300 in foregone fee), and onboarding plus tasting samples about $150.</w:t>
+        <w:t xml:space="preserve"> = a sales commission of about $400, plus one week of operating cost (agent tokens and delivery, about $50) for the free first ingredient.</w:t>
       </w:r>
     </w:p>
     <w:p>
@@ -717,23 +856,7 @@
           <w:color w:val="16241C"/>
           <w:sz w:val="21"/>
         </w:rPr>
-        <w:t xml:space="preserve"> about </w:t>
-      </w:r>
-      <w:r>
-        <w:rPr>
-          <w:b/>
-          <w:color w:val="16241C"/>
-          <w:sz w:val="21"/>
-        </w:rPr>
-        <w:t>one to two months</w:t>
-      </w:r>
-      <w:r>
-        <w:rPr>
-          <w:b w:val="0"/>
-          <w:color w:val="16241C"/>
-          <w:sz w:val="21"/>
-        </w:rPr>
-        <w:t xml:space="preserve"> at target margin.</w:t>
+        <w:t xml:space="preserve"> under one month at target margin.</w:t>
       </w:r>
     </w:p>
     <w:p>
@@ -1037,7 +1160,7 @@
           <w:color w:val="16241C"/>
           <w:sz w:val="21"/>
         </w:rPr>
-        <w:t>part-time industry insider</w:t>
+        <w:t>part-time, commissioned salesperson</w:t>
       </w:r>
       <w:r>
         <w:rPr>
@@ -1045,7 +1168,7 @@
           <w:color w:val="16241C"/>
           <w:sz w:val="21"/>
         </w:rPr>
-        <w:t xml:space="preserve"> with existing restaurant relationships in the market.</w:t>
+        <w:t xml:space="preserve"> with existing relationships in the local restaurant scene.</w:t>
       </w:r>
     </w:p>
     <w:p>
@@ -1058,7 +1181,7 @@
           <w:color w:val="5B6B60"/>
           <w:sz w:val="19"/>
         </w:rPr>
-        <w:t>To complete before sending: the insider's name and relationships, and one concrete figure from your climate-migration research.</w:t>
+        <w:t>To complete before sending: the salesperson's name and relationships, and one concrete figure from your climate-migration research.</w:t>
       </w:r>
     </w:p>
     <w:p>

</xml_diff>

<commit_message>
docs: pre-read GTM as a 4-step ranked list (farms; show savings via audit; risk-free offer; expand)
</commit_message>
<xml_diff>
--- a/pitch/cropconnect-preread.docx
+++ b/pitch/cropconnect-preread.docx
@@ -917,7 +917,7 @@
           <w:color w:val="16241C"/>
           <w:sz w:val="21"/>
         </w:rPr>
-        <w:t>We win one metro at a time and earn density before expanding. The Indianapolis plan has three steps:</w:t>
+        <w:t>We win one metro at a time and earn density before expanding. The Indianapolis plan, in order:</w:t>
       </w:r>
     </w:p>
     <w:p>
@@ -931,7 +931,7 @@
           <w:color w:val="16241C"/>
           <w:sz w:val="21"/>
         </w:rPr>
-        <w:t>Onboard the farms first.</w:t>
+        <w:t>Onboard the farms.</w:t>
       </w:r>
       <w:r>
         <w:rPr>
@@ -953,7 +953,7 @@
           <w:color w:val="16241C"/>
           <w:sz w:val="21"/>
         </w:rPr>
-        <w:t>Onboard restaurants with the audit.</w:t>
+        <w:t>Show restaurants their savings.</w:t>
       </w:r>
       <w:r>
         <w:rPr>
@@ -961,7 +961,29 @@
           <w:color w:val="16241C"/>
           <w:sz w:val="21"/>
         </w:rPr>
-        <w:t xml:space="preserve"> For each target we run the free audit on their public menu and bring a specific, quantified estimate of the margin they are leaving behind. The offer removes their risk: first ingredient free, ten-minute setup, cancel any month, with a guarantee. We start with one ingredient (about $400/month) and grow the account toward the $896 blended ARPA.</w:t>
+        <w:t xml:space="preserve"> For each target we run the free audit on their public menu and bring a specific, quantified estimate of the money they could save and the margin they are leaving behind.</w:t>
+      </w:r>
+    </w:p>
+    <w:p>
+      <w:pPr>
+        <w:pStyle w:val="ListNumber"/>
+        <w:spacing w:after="80"/>
+      </w:pPr>
+      <w:r>
+        <w:rPr>
+          <w:b/>
+          <w:color w:val="16241C"/>
+          <w:sz w:val="21"/>
+        </w:rPr>
+        <w:t>Win them with a risk-free offer.</w:t>
+      </w:r>
+      <w:r>
+        <w:rPr>
+          <w:b w:val="0"/>
+          <w:color w:val="16241C"/>
+          <w:sz w:val="21"/>
+        </w:rPr>
+        <w:t xml:space="preserve"> First ingredient free, free ten-minute setup, cancel any month, backed by a guarantee. We start with one ingredient (about $400/month) and grow the account toward the $896 blended ARPA.</w:t>
       </w:r>
     </w:p>
     <w:p>

</xml_diff>

<commit_message>
docs: pre-read Team — replace salesperson with a sourcing cofounder familiar with the market
</commit_message>
<xml_diff>
--- a/pitch/cropconnect-preread.docx
+++ b/pitch/cropconnect-preread.docx
@@ -1174,7 +1174,7 @@
           <w:color w:val="16241C"/>
           <w:sz w:val="21"/>
         </w:rPr>
-        <w:t xml:space="preserve">, from the agent to the contracts and escrow, which is why a working platform already exists at the pre-seed stage. Early sales are led by a </w:t>
+        <w:t xml:space="preserve">, from the agent to the contracts and escrow, which is why a working platform already exists at the pre-seed stage. A </w:t>
       </w:r>
       <w:r>
         <w:rPr>
@@ -1182,7 +1182,7 @@
           <w:color w:val="16241C"/>
           <w:sz w:val="21"/>
         </w:rPr>
-        <w:t>part-time, commissioned salesperson</w:t>
+        <w:t>cofounder</w:t>
       </w:r>
       <w:r>
         <w:rPr>
@@ -1190,7 +1190,7 @@
           <w:color w:val="16241C"/>
           <w:sz w:val="21"/>
         </w:rPr>
-        <w:t xml:space="preserve"> with existing relationships in the local restaurant scene.</w:t>
+        <w:t xml:space="preserve"> leads sourcing and supplier relationships, bringing deep familiarity with the local restaurant and farm market and the connections to onboard both farms and restaurants quickly.</w:t>
       </w:r>
     </w:p>
     <w:p>
@@ -1203,7 +1203,7 @@
           <w:color w:val="5B6B60"/>
           <w:sz w:val="19"/>
         </w:rPr>
-        <w:t>To complete before sending: the salesperson's name and relationships, and one concrete figure from your climate-migration research.</w:t>
+        <w:t>To complete before sending: the cofounder's name and background, and one concrete figure from your climate-migration research.</w:t>
       </w:r>
     </w:p>
     <w:p>

</xml_diff>

<commit_message>
docs: pre-read Team — frame sourcing role as first key hire (Head of Sourcing) with candidate profile, not a cofounder
</commit_message>
<xml_diff>
--- a/pitch/cropconnect-preread.docx
+++ b/pitch/cropconnect-preread.docx
@@ -1174,7 +1174,7 @@
           <w:color w:val="16241C"/>
           <w:sz w:val="21"/>
         </w:rPr>
-        <w:t xml:space="preserve">, from the agent to the contracts and escrow, which is why a working platform already exists at the pre-seed stage. A </w:t>
+        <w:t xml:space="preserve">, from the agent to the contracts and escrow, which is why a working platform already exists at the pre-seed stage. The first hire this round funds is a </w:t>
       </w:r>
       <w:r>
         <w:rPr>
@@ -1182,7 +1182,7 @@
           <w:color w:val="16241C"/>
           <w:sz w:val="21"/>
         </w:rPr>
-        <w:t>cofounder</w:t>
+        <w:t>Head of Sourcing</w:t>
       </w:r>
       <w:r>
         <w:rPr>
@@ -1190,7 +1190,39 @@
           <w:color w:val="16241C"/>
           <w:sz w:val="21"/>
         </w:rPr>
-        <w:t xml:space="preserve"> leads sourcing and supplier relationships, bringing deep familiarity with the local restaurant and farm market and the connections to onboard both farms and restaurants quickly.</w:t>
+        <w:t xml:space="preserve">, who builds and manages the local farm supply and uses existing restaurant relationships to open doors. The strongest candidates are </w:t>
+      </w:r>
+      <w:r>
+        <w:rPr>
+          <w:b/>
+          <w:color w:val="16241C"/>
+          <w:sz w:val="21"/>
+        </w:rPr>
+        <w:t>produce-distributor sales reps or territory managers</w:t>
+      </w:r>
+      <w:r>
+        <w:rPr>
+          <w:b w:val="0"/>
+          <w:color w:val="16241C"/>
+          <w:sz w:val="21"/>
+        </w:rPr>
+        <w:t xml:space="preserve"> (for example at a regional distributor such as Piazza Produce in Indianapolis) and </w:t>
+      </w:r>
+      <w:r>
+        <w:rPr>
+          <w:b/>
+          <w:color w:val="16241C"/>
+          <w:sz w:val="21"/>
+        </w:rPr>
+        <w:t>food-hub or farm-cooperative managers</w:t>
+      </w:r>
+      <w:r>
+        <w:rPr>
+          <w:b w:val="0"/>
+          <w:color w:val="16241C"/>
+          <w:sz w:val="21"/>
+        </w:rPr>
+        <w:t>, who already carry a book of restaurant accounts and know the local growers. A modest base plus meaningful equity is attractive to a strong rep ready to trade a commission grind for ownership.</w:t>
       </w:r>
     </w:p>
     <w:p>
@@ -1203,7 +1235,7 @@
           <w:color w:val="5B6B60"/>
           <w:sz w:val="19"/>
         </w:rPr>
-        <w:t>To complete before sending: the cofounder's name and background, and one concrete figure from your climate-migration research.</w:t>
+        <w:t>To complete before sending: one concrete figure from your climate-migration research, and the name of a sourcing hire if you have one lined up.</w:t>
       </w:r>
     </w:p>
     <w:p>

</xml_diff>

<commit_message>
docs: pre-read Team — integrate real Indianapolis sourcing-hire sources (Indianapolis Fruit, Piazza Produce, What Chefs Want; Hoosier Harvest Market, Farmers Cooperative Food Hub)
</commit_message>
<xml_diff>
--- a/pitch/cropconnect-preread.docx
+++ b/pitch/cropconnect-preread.docx
@@ -1206,7 +1206,7 @@
           <w:color w:val="16241C"/>
           <w:sz w:val="21"/>
         </w:rPr>
-        <w:t xml:space="preserve"> (for example at a regional distributor such as Piazza Produce in Indianapolis) and </w:t>
+        <w:t xml:space="preserve"> (for example at Indianapolis Fruit, Piazza Produce, or What Chefs Want) and </w:t>
       </w:r>
       <w:r>
         <w:rPr>
@@ -1222,7 +1222,7 @@
           <w:color w:val="16241C"/>
           <w:sz w:val="21"/>
         </w:rPr>
-        <w:t>, who already carry a book of restaurant accounts and know the local growers. A modest base plus meaningful equity is attractive to a strong rep ready to trade a commission grind for ownership.</w:t>
+        <w:t xml:space="preserve"> (for example Hoosier Harvest Market or the Farmers Cooperative Food Hub), who already carry a book of restaurant accounts and know the local growers. A modest base plus meaningful equity is attractive to a strong rep ready to trade a commission grind for ownership.</w:t>
       </w:r>
     </w:p>
     <w:p>

</xml_diff>

<commit_message>
docs: add founder (Keshav Krishnan) photo + short bio to deck cover and pre-read Team
</commit_message>
<xml_diff>
--- a/pitch/cropconnect-preread.docx
+++ b/pitch/cropconnect-preread.docx
@@ -1152,6 +1152,45 @@
     </w:p>
     <w:p>
       <w:pPr>
+        <w:spacing w:after="80"/>
+      </w:pPr>
+      <w:r>
+        <w:drawing>
+          <wp:inline xmlns:a="http://schemas.openxmlformats.org/drawingml/2006/main" xmlns:pic="http://schemas.openxmlformats.org/drawingml/2006/picture">
+            <wp:extent cx="1143000" cy="762000"/>
+            <wp:docPr id="1" name="Picture 1"/>
+            <wp:cNvGraphicFramePr>
+              <a:graphicFrameLocks noChangeAspect="1"/>
+            </wp:cNvGraphicFramePr>
+            <a:graphic>
+              <a:graphicData uri="http://schemas.openxmlformats.org/drawingml/2006/picture">
+                <pic:pic>
+                  <pic:nvPicPr>
+                    <pic:cNvPr id="0" name="keshav.jpg"/>
+                    <pic:cNvPicPr/>
+                  </pic:nvPicPr>
+                  <pic:blipFill>
+                    <a:blip r:embed="rId9"/>
+                    <a:stretch>
+                      <a:fillRect/>
+                    </a:stretch>
+                  </pic:blipFill>
+                  <pic:spPr>
+                    <a:xfrm>
+                      <a:off x="0" y="0"/>
+                      <a:ext cx="1143000" cy="762000"/>
+                    </a:xfrm>
+                    <a:prstGeom prst="rect"/>
+                  </pic:spPr>
+                </pic:pic>
+              </a:graphicData>
+            </a:graphic>
+          </wp:inline>
+        </w:drawing>
+      </w:r>
+    </w:p>
+    <w:p>
+      <w:pPr>
         <w:jc w:val="both"/>
       </w:pPr>
       <w:r>

</xml_diff>

<commit_message>
docs: pre-read GTM — source farms through Indianapolis non-profit/farmer networks (Indy Winter Farmers Market, Growing Places Indy, Farmers Cooperative Food Hub, Hoosier Harvest Market, FARMWISE); one partnership covers the 8-12 starter farms
</commit_message>
<xml_diff>
--- a/pitch/cropconnect-preread.docx
+++ b/pitch/cropconnect-preread.docx
@@ -944,7 +944,7 @@
           <w:color w:val="16241C"/>
           <w:sz w:val="21"/>
         </w:rPr>
-        <w:t>Onboard the farms.</w:t>
+        <w:t>Onboard the farms through local groups.</w:t>
       </w:r>
       <w:r>
         <w:rPr>
@@ -952,7 +952,7 @@
           <w:color w:val="16241C"/>
           <w:sz w:val="21"/>
         </w:rPr>
-        <w:t xml:space="preserve"> Pre-sign 8 to 12 vetted local farms across the core crops so supply and fill are guaranteed before we sell a single restaurant. This removes the cold-start problem.</w:t>
+        <w:t xml:space="preserve"> We bring farms on through Indianapolis non-profit and farmer networks that already aggregate dozens of vetted local growers: the Indy Winter Farmers Market, Growing Places Indy, the Farmers Cooperative Food Hub, Hoosier Harvest Market, and FARMWISE Indiana. A single one of these partnerships covers our 8 to 12 starter farms on its own, so supply and fill are guaranteed before we sell a restaurant. This removes the cold-start problem and gives us instant credibility with growers.</w:t>
       </w:r>
     </w:p>
     <w:p>

</xml_diff>

<commit_message>
assets: rotate founder photo -90 (portrait); regenerate deck PDF + pre-read with the corrected image
</commit_message>
<xml_diff>
--- a/pitch/cropconnect-preread.docx
+++ b/pitch/cropconnect-preread.docx
@@ -1157,7 +1157,7 @@
       <w:r>
         <w:drawing>
           <wp:inline xmlns:a="http://schemas.openxmlformats.org/drawingml/2006/main" xmlns:pic="http://schemas.openxmlformats.org/drawingml/2006/picture">
-            <wp:extent cx="1143000" cy="762000"/>
+            <wp:extent cx="1143000" cy="1714500"/>
             <wp:docPr id="1" name="Picture 1"/>
             <wp:cNvGraphicFramePr>
               <a:graphicFrameLocks noChangeAspect="1"/>
@@ -1178,7 +1178,7 @@
                   <pic:spPr>
                     <a:xfrm>
                       <a:off x="0" y="0"/>
-                      <a:ext cx="1143000" cy="762000"/>
+                      <a:ext cx="1143000" cy="1714500"/>
                     </a:xfrm>
                     <a:prstGeom prst="rect"/>
                   </pic:spPr>

</xml_diff>

<commit_message>
docs: pre-read Team — add founder's research paper as a clickable link (researchsquare rs-9181113)
</commit_message>
<xml_diff>
--- a/pitch/cropconnect-preread.docx
+++ b/pitch/cropconnect-preread.docx
@@ -1292,6 +1292,29 @@
     </w:p>
     <w:p>
       <w:pPr>
+        <w:spacing w:before="80"/>
+      </w:pPr>
+      <w:r>
+        <w:rPr>
+          <w:b/>
+          <w:color w:val="16241C"/>
+          <w:sz w:val="20"/>
+        </w:rPr>
+        <w:t xml:space="preserve">Founder's research, the economic cost of climate-driven migration: </w:t>
+      </w:r>
+      <w:hyperlink r:id="rId10">
+        <w:r>
+          <w:rPr>
+            <w:color w:val="235C3A"/>
+            <w:u w:val="single"/>
+            <w:sz w:val="20"/>
+          </w:rPr>
+          <w:t>https://www.researchsquare.com/article/rs-9181113/v1</w:t>
+        </w:r>
+      </w:hyperlink>
+    </w:p>
+    <w:p>
+      <w:pPr>
         <w:spacing w:after="80"/>
       </w:pPr>
       <w:r>
@@ -1300,7 +1323,7 @@
           <w:color w:val="5B6B60"/>
           <w:sz w:val="19"/>
         </w:rPr>
-        <w:t>To complete before sending: one concrete figure from your climate-migration research, and the name of a sourcing hire if you have one lined up.</w:t>
+        <w:t>To complete before sending: the name of a sourcing hire if you have one lined up.</w:t>
       </w:r>
     </w:p>
     <w:p>

</xml_diff>